<commit_message>
overall summary of the document section added
</commit_message>
<xml_diff>
--- a/New folder/PySpark create_DF_from_RDD.docx
+++ b/New folder/PySpark create_DF_from_RDD.docx
@@ -27,7 +27,27 @@
           <w:sz w:val="24"/>
           <w:szCs w:val="24"/>
         </w:rPr>
-        <w:t>Create DataFrame from RDD</w:t>
+        <w:t xml:space="preserve">Create </w:t>
+      </w:r>
+      <w:proofErr w:type="spellStart"/>
+      <w:r>
+        <w:rPr>
+          <w:b/>
+          <w:color w:val="1E73BE"/>
+          <w:sz w:val="24"/>
+          <w:szCs w:val="24"/>
+        </w:rPr>
+        <w:t>DataFrame</w:t>
+      </w:r>
+      <w:proofErr w:type="spellEnd"/>
+      <w:r>
+        <w:rPr>
+          <w:b/>
+          <w:color w:val="1E73BE"/>
+          <w:sz w:val="24"/>
+          <w:szCs w:val="24"/>
+        </w:rPr>
+        <w:t xml:space="preserve"> from RDD</w:t>
       </w:r>
     </w:p>
     <w:p>
@@ -52,7 +72,38 @@
           <w:sz w:val="24"/>
           <w:szCs w:val="24"/>
         </w:rPr>
-        <w:t>1.1 Using toDF() function</w:t>
+        <w:t xml:space="preserve">1.1 Using </w:t>
+      </w:r>
+      <w:proofErr w:type="spellStart"/>
+      <w:proofErr w:type="gramStart"/>
+      <w:r>
+        <w:rPr>
+          <w:b/>
+          <w:color w:val="1E73BE"/>
+          <w:sz w:val="24"/>
+          <w:szCs w:val="24"/>
+        </w:rPr>
+        <w:t>toDF</w:t>
+      </w:r>
+      <w:proofErr w:type="spellEnd"/>
+      <w:r>
+        <w:rPr>
+          <w:b/>
+          <w:color w:val="1E73BE"/>
+          <w:sz w:val="24"/>
+          <w:szCs w:val="24"/>
+        </w:rPr>
+        <w:t>(</w:t>
+      </w:r>
+      <w:proofErr w:type="gramEnd"/>
+      <w:r>
+        <w:rPr>
+          <w:b/>
+          <w:color w:val="1E73BE"/>
+          <w:sz w:val="24"/>
+          <w:szCs w:val="24"/>
+        </w:rPr>
+        <w:t>) function</w:t>
       </w:r>
     </w:p>
     <w:p>
@@ -108,7 +159,23 @@
                 <w:sz w:val="24"/>
                 <w:szCs w:val="24"/>
               </w:rPr>
-              <w:t>columns = ["language","users_count"]</w:t>
+              <w:t>columns = ["language","</w:t>
+            </w:r>
+            <w:proofErr w:type="spellStart"/>
+            <w:r>
+              <w:rPr>
+                <w:sz w:val="24"/>
+                <w:szCs w:val="24"/>
+              </w:rPr>
+              <w:t>users_count</w:t>
+            </w:r>
+            <w:proofErr w:type="spellEnd"/>
+            <w:r>
+              <w:rPr>
+                <w:sz w:val="24"/>
+                <w:szCs w:val="24"/>
+              </w:rPr>
+              <w:t>"]</w:t>
             </w:r>
           </w:p>
           <w:p>
@@ -150,13 +217,87 @@
           <w:szCs w:val="24"/>
         </w:rPr>
       </w:pPr>
-      <w:r>
-        <w:rPr>
-          <w:sz w:val="24"/>
-          <w:szCs w:val="24"/>
-          <w:shd w:val="clear" w:color="auto" w:fill="F9F9F9"/>
-        </w:rPr>
-        <w:t>PySpark RDD’s toDF() method is used to create a DataFrame from the existing RDD. Since RDD doesn’t have columns, the DataFrame is created with default column names “_1” and “_2” as we have two columns.</w:t>
+      <w:proofErr w:type="spellStart"/>
+      <w:r>
+        <w:rPr>
+          <w:sz w:val="24"/>
+          <w:szCs w:val="24"/>
+          <w:shd w:val="clear" w:color="auto" w:fill="F9F9F9"/>
+        </w:rPr>
+        <w:t>PySpark</w:t>
+      </w:r>
+      <w:proofErr w:type="spellEnd"/>
+      <w:r>
+        <w:rPr>
+          <w:sz w:val="24"/>
+          <w:szCs w:val="24"/>
+          <w:shd w:val="clear" w:color="auto" w:fill="F9F9F9"/>
+        </w:rPr>
+        <w:t xml:space="preserve"> RDD’s </w:t>
+      </w:r>
+      <w:proofErr w:type="spellStart"/>
+      <w:proofErr w:type="gramStart"/>
+      <w:r>
+        <w:rPr>
+          <w:sz w:val="24"/>
+          <w:szCs w:val="24"/>
+          <w:shd w:val="clear" w:color="auto" w:fill="F9F9F9"/>
+        </w:rPr>
+        <w:t>toDF</w:t>
+      </w:r>
+      <w:proofErr w:type="spellEnd"/>
+      <w:r>
+        <w:rPr>
+          <w:sz w:val="24"/>
+          <w:szCs w:val="24"/>
+          <w:shd w:val="clear" w:color="auto" w:fill="F9F9F9"/>
+        </w:rPr>
+        <w:t>(</w:t>
+      </w:r>
+      <w:proofErr w:type="gramEnd"/>
+      <w:r>
+        <w:rPr>
+          <w:sz w:val="24"/>
+          <w:szCs w:val="24"/>
+          <w:shd w:val="clear" w:color="auto" w:fill="F9F9F9"/>
+        </w:rPr>
+        <w:t xml:space="preserve">) method is used to create a </w:t>
+      </w:r>
+      <w:proofErr w:type="spellStart"/>
+      <w:r>
+        <w:rPr>
+          <w:sz w:val="24"/>
+          <w:szCs w:val="24"/>
+          <w:shd w:val="clear" w:color="auto" w:fill="F9F9F9"/>
+        </w:rPr>
+        <w:t>DataFrame</w:t>
+      </w:r>
+      <w:proofErr w:type="spellEnd"/>
+      <w:r>
+        <w:rPr>
+          <w:sz w:val="24"/>
+          <w:szCs w:val="24"/>
+          <w:shd w:val="clear" w:color="auto" w:fill="F9F9F9"/>
+        </w:rPr>
+        <w:t xml:space="preserve"> from the existing RDD. Since RDD doesn’t have columns, the </w:t>
+      </w:r>
+      <w:proofErr w:type="spellStart"/>
+      <w:r>
+        <w:rPr>
+          <w:sz w:val="24"/>
+          <w:szCs w:val="24"/>
+          <w:shd w:val="clear" w:color="auto" w:fill="F9F9F9"/>
+        </w:rPr>
+        <w:t>DataFrame</w:t>
+      </w:r>
+      <w:proofErr w:type="spellEnd"/>
+      <w:r>
+        <w:rPr>
+          <w:sz w:val="24"/>
+          <w:szCs w:val="24"/>
+          <w:shd w:val="clear" w:color="auto" w:fill="F9F9F9"/>
+        </w:rPr>
+        <w:t xml:space="preserve"> is created with default column names “_1” and “_2” as we have two columns.</w:t>
       </w:r>
     </w:p>
     <w:p>
@@ -215,12 +356,39 @@
                 <w:szCs w:val="24"/>
               </w:rPr>
             </w:pPr>
-            <w:r>
-              <w:rPr>
-                <w:sz w:val="24"/>
-                <w:szCs w:val="24"/>
-              </w:rPr>
-              <w:t>rdd = spark.sparkContext.parallelize(data)</w:t>
+            <w:proofErr w:type="spellStart"/>
+            <w:r>
+              <w:rPr>
+                <w:sz w:val="24"/>
+                <w:szCs w:val="24"/>
+              </w:rPr>
+              <w:t>rdd</w:t>
+            </w:r>
+            <w:proofErr w:type="spellEnd"/>
+            <w:r>
+              <w:rPr>
+                <w:sz w:val="24"/>
+                <w:szCs w:val="24"/>
+              </w:rPr>
+              <w:t xml:space="preserve"> = </w:t>
+            </w:r>
+            <w:proofErr w:type="spellStart"/>
+            <w:proofErr w:type="gramStart"/>
+            <w:r>
+              <w:rPr>
+                <w:sz w:val="24"/>
+                <w:szCs w:val="24"/>
+              </w:rPr>
+              <w:t>spark.sparkContext.parallelize</w:t>
+            </w:r>
+            <w:proofErr w:type="spellEnd"/>
+            <w:proofErr w:type="gramEnd"/>
+            <w:r>
+              <w:rPr>
+                <w:sz w:val="24"/>
+                <w:szCs w:val="24"/>
+              </w:rPr>
+              <w:t>(data)</w:t>
             </w:r>
           </w:p>
           <w:p>
@@ -245,7 +413,25 @@
                 <w:sz w:val="24"/>
                 <w:szCs w:val="24"/>
               </w:rPr>
-              <w:t>dfFromRDD1 = rdd.toDF()</w:t>
+              <w:t xml:space="preserve">dfFromRDD1 = </w:t>
+            </w:r>
+            <w:proofErr w:type="spellStart"/>
+            <w:proofErr w:type="gramStart"/>
+            <w:r>
+              <w:rPr>
+                <w:sz w:val="24"/>
+                <w:szCs w:val="24"/>
+              </w:rPr>
+              <w:t>rdd.toDF</w:t>
+            </w:r>
+            <w:proofErr w:type="spellEnd"/>
+            <w:proofErr w:type="gramEnd"/>
+            <w:r>
+              <w:rPr>
+                <w:sz w:val="24"/>
+                <w:szCs w:val="24"/>
+              </w:rPr>
+              <w:t>()</w:t>
             </w:r>
           </w:p>
           <w:p>
@@ -391,8 +577,37 @@
           <w:szCs w:val="24"/>
           <w:shd w:val="clear" w:color="auto" w:fill="F9F9F9"/>
         </w:rPr>
-        <w:t>If you want to provide column names to the DataFrame use the toDF</w:t>
-      </w:r>
+        <w:t xml:space="preserve">If you want to provide column names to the </w:t>
+      </w:r>
+      <w:proofErr w:type="spellStart"/>
+      <w:r>
+        <w:rPr>
+          <w:sz w:val="24"/>
+          <w:szCs w:val="24"/>
+          <w:shd w:val="clear" w:color="auto" w:fill="F9F9F9"/>
+        </w:rPr>
+        <w:t>DataFrame</w:t>
+      </w:r>
+      <w:proofErr w:type="spellEnd"/>
+      <w:r>
+        <w:rPr>
+          <w:sz w:val="24"/>
+          <w:szCs w:val="24"/>
+          <w:shd w:val="clear" w:color="auto" w:fill="F9F9F9"/>
+        </w:rPr>
+        <w:t xml:space="preserve"> use the </w:t>
+      </w:r>
+      <w:proofErr w:type="spellStart"/>
+      <w:proofErr w:type="gramStart"/>
+      <w:r>
+        <w:rPr>
+          <w:sz w:val="24"/>
+          <w:szCs w:val="24"/>
+          <w:shd w:val="clear" w:color="auto" w:fill="F9F9F9"/>
+        </w:rPr>
+        <w:t>toDF</w:t>
+      </w:r>
+      <w:proofErr w:type="spellEnd"/>
       <w:r>
         <w:rPr>
           <w:rFonts w:ascii="Courier New" w:eastAsia="Courier New" w:hAnsi="Courier New" w:cs="Courier New"/>
@@ -400,7 +615,17 @@
           <w:szCs w:val="24"/>
           <w:shd w:val="clear" w:color="auto" w:fill="E3E3E4"/>
         </w:rPr>
-        <w:t xml:space="preserve">() </w:t>
+        <w:t>(</w:t>
+      </w:r>
+      <w:proofErr w:type="gramEnd"/>
+      <w:r>
+        <w:rPr>
+          <w:rFonts w:ascii="Courier New" w:eastAsia="Courier New" w:hAnsi="Courier New" w:cs="Courier New"/>
+          <w:sz w:val="24"/>
+          <w:szCs w:val="24"/>
+          <w:shd w:val="clear" w:color="auto" w:fill="E3E3E4"/>
+        </w:rPr>
+        <w:t xml:space="preserve">) </w:t>
       </w:r>
       <w:r>
         <w:rPr>
@@ -505,7 +730,27 @@
                 <w:szCs w:val="24"/>
                 <w:shd w:val="clear" w:color="auto" w:fill="F9F9F9"/>
               </w:rPr>
-              <w:t>dfFromRDD1 = rdd.toDF(columns)</w:t>
+              <w:t xml:space="preserve">dfFromRDD1 = </w:t>
+            </w:r>
+            <w:proofErr w:type="spellStart"/>
+            <w:proofErr w:type="gramStart"/>
+            <w:r>
+              <w:rPr>
+                <w:sz w:val="24"/>
+                <w:szCs w:val="24"/>
+                <w:shd w:val="clear" w:color="auto" w:fill="F9F9F9"/>
+              </w:rPr>
+              <w:t>rdd.toDF</w:t>
+            </w:r>
+            <w:proofErr w:type="spellEnd"/>
+            <w:proofErr w:type="gramEnd"/>
+            <w:r>
+              <w:rPr>
+                <w:sz w:val="24"/>
+                <w:szCs w:val="24"/>
+                <w:shd w:val="clear" w:color="auto" w:fill="F9F9F9"/>
+              </w:rPr>
+              <w:t>(columns)</w:t>
             </w:r>
           </w:p>
           <w:p>
@@ -746,7 +991,25 @@
           <w:szCs w:val="24"/>
           <w:shd w:val="clear" w:color="auto" w:fill="F9F9F9"/>
         </w:rPr>
-        <w:t>|language|users_count|</w:t>
+        <w:t>|</w:t>
+      </w:r>
+      <w:proofErr w:type="spellStart"/>
+      <w:r>
+        <w:rPr>
+          <w:sz w:val="24"/>
+          <w:szCs w:val="24"/>
+          <w:shd w:val="clear" w:color="auto" w:fill="F9F9F9"/>
+        </w:rPr>
+        <w:t>language|users_count</w:t>
+      </w:r>
+      <w:proofErr w:type="spellEnd"/>
+      <w:r>
+        <w:rPr>
+          <w:sz w:val="24"/>
+          <w:szCs w:val="24"/>
+          <w:shd w:val="clear" w:color="auto" w:fill="F9F9F9"/>
+        </w:rPr>
+        <w:t>|</w:t>
       </w:r>
     </w:p>
     <w:p>
@@ -797,13 +1060,23 @@
           <w:shd w:val="clear" w:color="auto" w:fill="F9F9F9"/>
         </w:rPr>
       </w:pPr>
-      <w:r>
-        <w:rPr>
-          <w:sz w:val="24"/>
-          <w:szCs w:val="24"/>
-          <w:shd w:val="clear" w:color="auto" w:fill="F9F9F9"/>
-        </w:rPr>
-        <w:t>|  Python|     100000|</w:t>
+      <w:proofErr w:type="gramStart"/>
+      <w:r>
+        <w:rPr>
+          <w:sz w:val="24"/>
+          <w:szCs w:val="24"/>
+          <w:shd w:val="clear" w:color="auto" w:fill="F9F9F9"/>
+        </w:rPr>
+        <w:t>|  Python</w:t>
+      </w:r>
+      <w:proofErr w:type="gramEnd"/>
+      <w:r>
+        <w:rPr>
+          <w:sz w:val="24"/>
+          <w:szCs w:val="24"/>
+          <w:shd w:val="clear" w:color="auto" w:fill="F9F9F9"/>
+        </w:rPr>
+        <w:t>|     100000|</w:t>
       </w:r>
     </w:p>
     <w:p>
@@ -898,6 +1171,7 @@
       </w:pPr>
       <w:bookmarkStart w:id="2" w:name="_oem80ucpm4z" w:colFirst="0" w:colLast="0"/>
       <w:bookmarkEnd w:id="2"/>
+      <w:proofErr w:type="spellStart"/>
       <w:r>
         <w:rPr>
           <w:b/>
@@ -906,8 +1180,9 @@
           <w:szCs w:val="24"/>
           <w:shd w:val="clear" w:color="auto" w:fill="F9F9F9"/>
         </w:rPr>
-        <w:t xml:space="preserve">PySpark StructType &amp; </w:t>
-      </w:r>
+        <w:t>PySpark</w:t>
+      </w:r>
+      <w:proofErr w:type="spellEnd"/>
       <w:r>
         <w:rPr>
           <w:b/>
@@ -916,7 +1191,29 @@
           <w:szCs w:val="24"/>
           <w:shd w:val="clear" w:color="auto" w:fill="F9F9F9"/>
         </w:rPr>
-        <w:t>StructField Explained with Examples</w:t>
+        <w:t xml:space="preserve"> StructType &amp; </w:t>
+      </w:r>
+      <w:proofErr w:type="spellStart"/>
+      <w:r>
+        <w:rPr>
+          <w:b/>
+          <w:color w:val="1E73BE"/>
+          <w:sz w:val="24"/>
+          <w:szCs w:val="24"/>
+          <w:shd w:val="clear" w:color="auto" w:fill="F9F9F9"/>
+        </w:rPr>
+        <w:t>StructField</w:t>
+      </w:r>
+      <w:proofErr w:type="spellEnd"/>
+      <w:r>
+        <w:rPr>
+          <w:b/>
+          <w:color w:val="1E73BE"/>
+          <w:sz w:val="24"/>
+          <w:szCs w:val="24"/>
+          <w:shd w:val="clear" w:color="auto" w:fill="F9F9F9"/>
+        </w:rPr>
+        <w:t xml:space="preserve"> Explained with Examples</w:t>
       </w:r>
     </w:p>
     <w:p>
@@ -1002,8 +1299,18 @@
                 <w:szCs w:val="24"/>
                 <w:shd w:val="clear" w:color="auto" w:fill="F9F9F9"/>
               </w:rPr>
-              <w:t>import pyspark</w:t>
-            </w:r>
+              <w:t xml:space="preserve">import </w:t>
+            </w:r>
+            <w:proofErr w:type="spellStart"/>
+            <w:r>
+              <w:rPr>
+                <w:sz w:val="24"/>
+                <w:szCs w:val="24"/>
+                <w:shd w:val="clear" w:color="auto" w:fill="F9F9F9"/>
+              </w:rPr>
+              <w:t>pyspark</w:t>
+            </w:r>
+            <w:proofErr w:type="spellEnd"/>
           </w:p>
           <w:p>
             <w:pPr>
@@ -1048,8 +1355,76 @@
                 <w:szCs w:val="24"/>
                 <w:shd w:val="clear" w:color="auto" w:fill="F9F9F9"/>
               </w:rPr>
-              <w:t>from pyspark.sql.types import StructType,StructField, StringType, IntegerType</w:t>
-            </w:r>
+              <w:t xml:space="preserve">from </w:t>
+            </w:r>
+            <w:proofErr w:type="spellStart"/>
+            <w:proofErr w:type="gramStart"/>
+            <w:r>
+              <w:rPr>
+                <w:sz w:val="24"/>
+                <w:szCs w:val="24"/>
+                <w:shd w:val="clear" w:color="auto" w:fill="F9F9F9"/>
+              </w:rPr>
+              <w:t>pyspark.sql.types</w:t>
+            </w:r>
+            <w:proofErr w:type="spellEnd"/>
+            <w:proofErr w:type="gramEnd"/>
+            <w:r>
+              <w:rPr>
+                <w:sz w:val="24"/>
+                <w:szCs w:val="24"/>
+                <w:shd w:val="clear" w:color="auto" w:fill="F9F9F9"/>
+              </w:rPr>
+              <w:t xml:space="preserve"> import </w:t>
+            </w:r>
+            <w:proofErr w:type="spellStart"/>
+            <w:proofErr w:type="gramStart"/>
+            <w:r>
+              <w:rPr>
+                <w:sz w:val="24"/>
+                <w:szCs w:val="24"/>
+                <w:shd w:val="clear" w:color="auto" w:fill="F9F9F9"/>
+              </w:rPr>
+              <w:t>StructType,StructField</w:t>
+            </w:r>
+            <w:proofErr w:type="spellEnd"/>
+            <w:proofErr w:type="gramEnd"/>
+            <w:r>
+              <w:rPr>
+                <w:sz w:val="24"/>
+                <w:szCs w:val="24"/>
+                <w:shd w:val="clear" w:color="auto" w:fill="F9F9F9"/>
+              </w:rPr>
+              <w:t xml:space="preserve">, </w:t>
+            </w:r>
+            <w:proofErr w:type="spellStart"/>
+            <w:r>
+              <w:rPr>
+                <w:sz w:val="24"/>
+                <w:szCs w:val="24"/>
+                <w:shd w:val="clear" w:color="auto" w:fill="F9F9F9"/>
+              </w:rPr>
+              <w:t>StringType</w:t>
+            </w:r>
+            <w:proofErr w:type="spellEnd"/>
+            <w:r>
+              <w:rPr>
+                <w:sz w:val="24"/>
+                <w:szCs w:val="24"/>
+                <w:shd w:val="clear" w:color="auto" w:fill="F9F9F9"/>
+              </w:rPr>
+              <w:t xml:space="preserve">, </w:t>
+            </w:r>
+            <w:proofErr w:type="spellStart"/>
+            <w:r>
+              <w:rPr>
+                <w:sz w:val="24"/>
+                <w:szCs w:val="24"/>
+                <w:shd w:val="clear" w:color="auto" w:fill="F9F9F9"/>
+              </w:rPr>
+              <w:t>IntegerType</w:t>
+            </w:r>
+            <w:proofErr w:type="spellEnd"/>
           </w:p>
           <w:p>
             <w:pPr>
@@ -1221,7 +1596,25 @@
                 <w:szCs w:val="24"/>
                 <w:shd w:val="clear" w:color="auto" w:fill="F9F9F9"/>
               </w:rPr>
-              <w:t xml:space="preserve">    ("Jen","Mary","Brown","","F",-1)</w:t>
+              <w:t xml:space="preserve">    ("Jen","Mary","Brown","","F</w:t>
+            </w:r>
+            <w:proofErr w:type="gramStart"/>
+            <w:r>
+              <w:rPr>
+                <w:sz w:val="24"/>
+                <w:szCs w:val="24"/>
+                <w:shd w:val="clear" w:color="auto" w:fill="F9F9F9"/>
+              </w:rPr>
+              <w:t>",-</w:t>
+            </w:r>
+            <w:proofErr w:type="gramEnd"/>
+            <w:r>
+              <w:rPr>
+                <w:sz w:val="24"/>
+                <w:szCs w:val="24"/>
+                <w:shd w:val="clear" w:color="auto" w:fill="F9F9F9"/>
+              </w:rPr>
+              <w:t>1)</w:t>
             </w:r>
           </w:p>
           <w:p>
@@ -1294,7 +1687,25 @@
                 <w:szCs w:val="24"/>
                 <w:shd w:val="clear" w:color="auto" w:fill="F9F9F9"/>
               </w:rPr>
-              <w:t>schema = StructType([ \</w:t>
+              <w:t xml:space="preserve">schema = </w:t>
+            </w:r>
+            <w:proofErr w:type="gramStart"/>
+            <w:r>
+              <w:rPr>
+                <w:sz w:val="24"/>
+                <w:szCs w:val="24"/>
+                <w:shd w:val="clear" w:color="auto" w:fill="F9F9F9"/>
+              </w:rPr>
+              <w:t>StructType(</w:t>
+            </w:r>
+            <w:proofErr w:type="gramEnd"/>
+            <w:r>
+              <w:rPr>
+                <w:sz w:val="24"/>
+                <w:szCs w:val="24"/>
+                <w:shd w:val="clear" w:color="auto" w:fill="F9F9F9"/>
+              </w:rPr>
+              <w:t>[ \</w:t>
             </w:r>
           </w:p>
           <w:p>
@@ -1321,7 +1732,81 @@
                 <w:szCs w:val="24"/>
                 <w:shd w:val="clear" w:color="auto" w:fill="F9F9F9"/>
               </w:rPr>
-              <w:t xml:space="preserve">    StructField("firstname",StringType(),True), \</w:t>
+              <w:t xml:space="preserve">    </w:t>
+            </w:r>
+            <w:proofErr w:type="spellStart"/>
+            <w:r>
+              <w:rPr>
+                <w:sz w:val="24"/>
+                <w:szCs w:val="24"/>
+                <w:shd w:val="clear" w:color="auto" w:fill="F9F9F9"/>
+              </w:rPr>
+              <w:t>StructField</w:t>
+            </w:r>
+            <w:proofErr w:type="spellEnd"/>
+            <w:r>
+              <w:rPr>
+                <w:sz w:val="24"/>
+                <w:szCs w:val="24"/>
+                <w:shd w:val="clear" w:color="auto" w:fill="F9F9F9"/>
+              </w:rPr>
+              <w:t>("</w:t>
+            </w:r>
+            <w:proofErr w:type="spellStart"/>
+            <w:r>
+              <w:rPr>
+                <w:sz w:val="24"/>
+                <w:szCs w:val="24"/>
+                <w:shd w:val="clear" w:color="auto" w:fill="F9F9F9"/>
+              </w:rPr>
+              <w:t>firstname</w:t>
+            </w:r>
+            <w:proofErr w:type="spellEnd"/>
+            <w:proofErr w:type="gramStart"/>
+            <w:r>
+              <w:rPr>
+                <w:sz w:val="24"/>
+                <w:szCs w:val="24"/>
+                <w:shd w:val="clear" w:color="auto" w:fill="F9F9F9"/>
+              </w:rPr>
+              <w:t>",</w:t>
+            </w:r>
+            <w:proofErr w:type="spellStart"/>
+            <w:r>
+              <w:rPr>
+                <w:sz w:val="24"/>
+                <w:szCs w:val="24"/>
+                <w:shd w:val="clear" w:color="auto" w:fill="F9F9F9"/>
+              </w:rPr>
+              <w:t>StringType</w:t>
+            </w:r>
+            <w:proofErr w:type="spellEnd"/>
+            <w:proofErr w:type="gramEnd"/>
+            <w:r>
+              <w:rPr>
+                <w:sz w:val="24"/>
+                <w:szCs w:val="24"/>
+                <w:shd w:val="clear" w:color="auto" w:fill="F9F9F9"/>
+              </w:rPr>
+              <w:t>(</w:t>
+            </w:r>
+            <w:proofErr w:type="gramStart"/>
+            <w:r>
+              <w:rPr>
+                <w:sz w:val="24"/>
+                <w:szCs w:val="24"/>
+                <w:shd w:val="clear" w:color="auto" w:fill="F9F9F9"/>
+              </w:rPr>
+              <w:t>),True</w:t>
+            </w:r>
+            <w:proofErr w:type="gramEnd"/>
+            <w:r>
+              <w:rPr>
+                <w:sz w:val="24"/>
+                <w:szCs w:val="24"/>
+                <w:shd w:val="clear" w:color="auto" w:fill="F9F9F9"/>
+              </w:rPr>
+              <w:t>), \</w:t>
             </w:r>
           </w:p>
           <w:p>
@@ -1348,7 +1833,81 @@
                 <w:szCs w:val="24"/>
                 <w:shd w:val="clear" w:color="auto" w:fill="F9F9F9"/>
               </w:rPr>
-              <w:t xml:space="preserve">    StructField("middlename",StringType(),True), \</w:t>
+              <w:t xml:space="preserve">    </w:t>
+            </w:r>
+            <w:proofErr w:type="spellStart"/>
+            <w:r>
+              <w:rPr>
+                <w:sz w:val="24"/>
+                <w:szCs w:val="24"/>
+                <w:shd w:val="clear" w:color="auto" w:fill="F9F9F9"/>
+              </w:rPr>
+              <w:t>StructField</w:t>
+            </w:r>
+            <w:proofErr w:type="spellEnd"/>
+            <w:r>
+              <w:rPr>
+                <w:sz w:val="24"/>
+                <w:szCs w:val="24"/>
+                <w:shd w:val="clear" w:color="auto" w:fill="F9F9F9"/>
+              </w:rPr>
+              <w:t>("</w:t>
+            </w:r>
+            <w:proofErr w:type="spellStart"/>
+            <w:r>
+              <w:rPr>
+                <w:sz w:val="24"/>
+                <w:szCs w:val="24"/>
+                <w:shd w:val="clear" w:color="auto" w:fill="F9F9F9"/>
+              </w:rPr>
+              <w:t>middlename</w:t>
+            </w:r>
+            <w:proofErr w:type="spellEnd"/>
+            <w:proofErr w:type="gramStart"/>
+            <w:r>
+              <w:rPr>
+                <w:sz w:val="24"/>
+                <w:szCs w:val="24"/>
+                <w:shd w:val="clear" w:color="auto" w:fill="F9F9F9"/>
+              </w:rPr>
+              <w:t>",</w:t>
+            </w:r>
+            <w:proofErr w:type="spellStart"/>
+            <w:r>
+              <w:rPr>
+                <w:sz w:val="24"/>
+                <w:szCs w:val="24"/>
+                <w:shd w:val="clear" w:color="auto" w:fill="F9F9F9"/>
+              </w:rPr>
+              <w:t>StringType</w:t>
+            </w:r>
+            <w:proofErr w:type="spellEnd"/>
+            <w:proofErr w:type="gramEnd"/>
+            <w:r>
+              <w:rPr>
+                <w:sz w:val="24"/>
+                <w:szCs w:val="24"/>
+                <w:shd w:val="clear" w:color="auto" w:fill="F9F9F9"/>
+              </w:rPr>
+              <w:t>(</w:t>
+            </w:r>
+            <w:proofErr w:type="gramStart"/>
+            <w:r>
+              <w:rPr>
+                <w:sz w:val="24"/>
+                <w:szCs w:val="24"/>
+                <w:shd w:val="clear" w:color="auto" w:fill="F9F9F9"/>
+              </w:rPr>
+              <w:t>),True</w:t>
+            </w:r>
+            <w:proofErr w:type="gramEnd"/>
+            <w:r>
+              <w:rPr>
+                <w:sz w:val="24"/>
+                <w:szCs w:val="24"/>
+                <w:shd w:val="clear" w:color="auto" w:fill="F9F9F9"/>
+              </w:rPr>
+              <w:t>), \</w:t>
             </w:r>
           </w:p>
           <w:p>
@@ -1375,15 +1934,81 @@
                 <w:szCs w:val="24"/>
                 <w:shd w:val="clear" w:color="auto" w:fill="F9F9F9"/>
               </w:rPr>
-              <w:t xml:space="preserve">    StructField("lastname</w:t>
-            </w:r>
-            <w:r>
-              <w:rPr>
-                <w:sz w:val="24"/>
-                <w:szCs w:val="24"/>
-                <w:shd w:val="clear" w:color="auto" w:fill="F9F9F9"/>
-              </w:rPr>
-              <w:t>",StringType(),True), \</w:t>
+              <w:t xml:space="preserve">    </w:t>
+            </w:r>
+            <w:proofErr w:type="spellStart"/>
+            <w:r>
+              <w:rPr>
+                <w:sz w:val="24"/>
+                <w:szCs w:val="24"/>
+                <w:shd w:val="clear" w:color="auto" w:fill="F9F9F9"/>
+              </w:rPr>
+              <w:t>StructField</w:t>
+            </w:r>
+            <w:proofErr w:type="spellEnd"/>
+            <w:r>
+              <w:rPr>
+                <w:sz w:val="24"/>
+                <w:szCs w:val="24"/>
+                <w:shd w:val="clear" w:color="auto" w:fill="F9F9F9"/>
+              </w:rPr>
+              <w:t>("</w:t>
+            </w:r>
+            <w:proofErr w:type="spellStart"/>
+            <w:r>
+              <w:rPr>
+                <w:sz w:val="24"/>
+                <w:szCs w:val="24"/>
+                <w:shd w:val="clear" w:color="auto" w:fill="F9F9F9"/>
+              </w:rPr>
+              <w:t>lastname</w:t>
+            </w:r>
+            <w:proofErr w:type="spellEnd"/>
+            <w:proofErr w:type="gramStart"/>
+            <w:r>
+              <w:rPr>
+                <w:sz w:val="24"/>
+                <w:szCs w:val="24"/>
+                <w:shd w:val="clear" w:color="auto" w:fill="F9F9F9"/>
+              </w:rPr>
+              <w:t>",</w:t>
+            </w:r>
+            <w:proofErr w:type="spellStart"/>
+            <w:r>
+              <w:rPr>
+                <w:sz w:val="24"/>
+                <w:szCs w:val="24"/>
+                <w:shd w:val="clear" w:color="auto" w:fill="F9F9F9"/>
+              </w:rPr>
+              <w:t>StringType</w:t>
+            </w:r>
+            <w:proofErr w:type="spellEnd"/>
+            <w:proofErr w:type="gramEnd"/>
+            <w:r>
+              <w:rPr>
+                <w:sz w:val="24"/>
+                <w:szCs w:val="24"/>
+                <w:shd w:val="clear" w:color="auto" w:fill="F9F9F9"/>
+              </w:rPr>
+              <w:t>(</w:t>
+            </w:r>
+            <w:proofErr w:type="gramStart"/>
+            <w:r>
+              <w:rPr>
+                <w:sz w:val="24"/>
+                <w:szCs w:val="24"/>
+                <w:shd w:val="clear" w:color="auto" w:fill="F9F9F9"/>
+              </w:rPr>
+              <w:t>),True</w:t>
+            </w:r>
+            <w:proofErr w:type="gramEnd"/>
+            <w:r>
+              <w:rPr>
+                <w:sz w:val="24"/>
+                <w:szCs w:val="24"/>
+                <w:shd w:val="clear" w:color="auto" w:fill="F9F9F9"/>
+              </w:rPr>
+              <w:t>), \</w:t>
             </w:r>
           </w:p>
           <w:p>
@@ -1410,7 +2035,63 @@
                 <w:szCs w:val="24"/>
                 <w:shd w:val="clear" w:color="auto" w:fill="F9F9F9"/>
               </w:rPr>
-              <w:t xml:space="preserve">    StructField("id", StringType(), True), \</w:t>
+              <w:t xml:space="preserve">    </w:t>
+            </w:r>
+            <w:proofErr w:type="spellStart"/>
+            <w:proofErr w:type="gramStart"/>
+            <w:r>
+              <w:rPr>
+                <w:sz w:val="24"/>
+                <w:szCs w:val="24"/>
+                <w:shd w:val="clear" w:color="auto" w:fill="F9F9F9"/>
+              </w:rPr>
+              <w:t>StructField</w:t>
+            </w:r>
+            <w:proofErr w:type="spellEnd"/>
+            <w:r>
+              <w:rPr>
+                <w:sz w:val="24"/>
+                <w:szCs w:val="24"/>
+                <w:shd w:val="clear" w:color="auto" w:fill="F9F9F9"/>
+              </w:rPr>
+              <w:t>(</w:t>
+            </w:r>
+            <w:proofErr w:type="gramEnd"/>
+            <w:r>
+              <w:rPr>
+                <w:sz w:val="24"/>
+                <w:szCs w:val="24"/>
+                <w:shd w:val="clear" w:color="auto" w:fill="F9F9F9"/>
+              </w:rPr>
+              <w:t xml:space="preserve">"id", </w:t>
+            </w:r>
+            <w:proofErr w:type="spellStart"/>
+            <w:proofErr w:type="gramStart"/>
+            <w:r>
+              <w:rPr>
+                <w:sz w:val="24"/>
+                <w:szCs w:val="24"/>
+                <w:shd w:val="clear" w:color="auto" w:fill="F9F9F9"/>
+              </w:rPr>
+              <w:t>StringType</w:t>
+            </w:r>
+            <w:proofErr w:type="spellEnd"/>
+            <w:r>
+              <w:rPr>
+                <w:sz w:val="24"/>
+                <w:szCs w:val="24"/>
+                <w:shd w:val="clear" w:color="auto" w:fill="F9F9F9"/>
+              </w:rPr>
+              <w:t>(</w:t>
+            </w:r>
+            <w:proofErr w:type="gramEnd"/>
+            <w:r>
+              <w:rPr>
+                <w:sz w:val="24"/>
+                <w:szCs w:val="24"/>
+                <w:shd w:val="clear" w:color="auto" w:fill="F9F9F9"/>
+              </w:rPr>
+              <w:t>), True), \</w:t>
             </w:r>
           </w:p>
           <w:p>
@@ -1437,7 +2118,63 @@
                 <w:szCs w:val="24"/>
                 <w:shd w:val="clear" w:color="auto" w:fill="F9F9F9"/>
               </w:rPr>
-              <w:t xml:space="preserve">    StructField("gender", StringType(), True), \</w:t>
+              <w:t xml:space="preserve">    </w:t>
+            </w:r>
+            <w:proofErr w:type="spellStart"/>
+            <w:proofErr w:type="gramStart"/>
+            <w:r>
+              <w:rPr>
+                <w:sz w:val="24"/>
+                <w:szCs w:val="24"/>
+                <w:shd w:val="clear" w:color="auto" w:fill="F9F9F9"/>
+              </w:rPr>
+              <w:t>StructField</w:t>
+            </w:r>
+            <w:proofErr w:type="spellEnd"/>
+            <w:r>
+              <w:rPr>
+                <w:sz w:val="24"/>
+                <w:szCs w:val="24"/>
+                <w:shd w:val="clear" w:color="auto" w:fill="F9F9F9"/>
+              </w:rPr>
+              <w:t>(</w:t>
+            </w:r>
+            <w:proofErr w:type="gramEnd"/>
+            <w:r>
+              <w:rPr>
+                <w:sz w:val="24"/>
+                <w:szCs w:val="24"/>
+                <w:shd w:val="clear" w:color="auto" w:fill="F9F9F9"/>
+              </w:rPr>
+              <w:t xml:space="preserve">"gender", </w:t>
+            </w:r>
+            <w:proofErr w:type="spellStart"/>
+            <w:proofErr w:type="gramStart"/>
+            <w:r>
+              <w:rPr>
+                <w:sz w:val="24"/>
+                <w:szCs w:val="24"/>
+                <w:shd w:val="clear" w:color="auto" w:fill="F9F9F9"/>
+              </w:rPr>
+              <w:t>StringType</w:t>
+            </w:r>
+            <w:proofErr w:type="spellEnd"/>
+            <w:r>
+              <w:rPr>
+                <w:sz w:val="24"/>
+                <w:szCs w:val="24"/>
+                <w:shd w:val="clear" w:color="auto" w:fill="F9F9F9"/>
+              </w:rPr>
+              <w:t>(</w:t>
+            </w:r>
+            <w:proofErr w:type="gramEnd"/>
+            <w:r>
+              <w:rPr>
+                <w:sz w:val="24"/>
+                <w:szCs w:val="24"/>
+                <w:shd w:val="clear" w:color="auto" w:fill="F9F9F9"/>
+              </w:rPr>
+              <w:t>), True), \</w:t>
             </w:r>
           </w:p>
           <w:p>
@@ -1464,7 +2201,63 @@
                 <w:szCs w:val="24"/>
                 <w:shd w:val="clear" w:color="auto" w:fill="F9F9F9"/>
               </w:rPr>
-              <w:t xml:space="preserve">    StructField("salary", IntegerType(), True) \</w:t>
+              <w:t xml:space="preserve">    </w:t>
+            </w:r>
+            <w:proofErr w:type="spellStart"/>
+            <w:proofErr w:type="gramStart"/>
+            <w:r>
+              <w:rPr>
+                <w:sz w:val="24"/>
+                <w:szCs w:val="24"/>
+                <w:shd w:val="clear" w:color="auto" w:fill="F9F9F9"/>
+              </w:rPr>
+              <w:t>StructField</w:t>
+            </w:r>
+            <w:proofErr w:type="spellEnd"/>
+            <w:r>
+              <w:rPr>
+                <w:sz w:val="24"/>
+                <w:szCs w:val="24"/>
+                <w:shd w:val="clear" w:color="auto" w:fill="F9F9F9"/>
+              </w:rPr>
+              <w:t>(</w:t>
+            </w:r>
+            <w:proofErr w:type="gramEnd"/>
+            <w:r>
+              <w:rPr>
+                <w:sz w:val="24"/>
+                <w:szCs w:val="24"/>
+                <w:shd w:val="clear" w:color="auto" w:fill="F9F9F9"/>
+              </w:rPr>
+              <w:t xml:space="preserve">"salary", </w:t>
+            </w:r>
+            <w:proofErr w:type="spellStart"/>
+            <w:proofErr w:type="gramStart"/>
+            <w:r>
+              <w:rPr>
+                <w:sz w:val="24"/>
+                <w:szCs w:val="24"/>
+                <w:shd w:val="clear" w:color="auto" w:fill="F9F9F9"/>
+              </w:rPr>
+              <w:t>IntegerType</w:t>
+            </w:r>
+            <w:proofErr w:type="spellEnd"/>
+            <w:r>
+              <w:rPr>
+                <w:sz w:val="24"/>
+                <w:szCs w:val="24"/>
+                <w:shd w:val="clear" w:color="auto" w:fill="F9F9F9"/>
+              </w:rPr>
+              <w:t>(</w:t>
+            </w:r>
+            <w:proofErr w:type="gramEnd"/>
+            <w:r>
+              <w:rPr>
+                <w:sz w:val="24"/>
+                <w:szCs w:val="24"/>
+                <w:shd w:val="clear" w:color="auto" w:fill="F9F9F9"/>
+              </w:rPr>
+              <w:t>), True) \</w:t>
             </w:r>
           </w:p>
           <w:p>
@@ -1779,7 +2572,25 @@
                 <w:szCs w:val="24"/>
                 <w:shd w:val="clear" w:color="auto" w:fill="F9F9F9"/>
               </w:rPr>
-              <w:t>schema = StructType([ \</w:t>
+              <w:t xml:space="preserve">schema = </w:t>
+            </w:r>
+            <w:proofErr w:type="gramStart"/>
+            <w:r>
+              <w:rPr>
+                <w:sz w:val="24"/>
+                <w:szCs w:val="24"/>
+                <w:shd w:val="clear" w:color="auto" w:fill="F9F9F9"/>
+              </w:rPr>
+              <w:t>StructType(</w:t>
+            </w:r>
+            <w:proofErr w:type="gramEnd"/>
+            <w:r>
+              <w:rPr>
+                <w:sz w:val="24"/>
+                <w:szCs w:val="24"/>
+                <w:shd w:val="clear" w:color="auto" w:fill="F9F9F9"/>
+              </w:rPr>
+              <w:t>[ \</w:t>
             </w:r>
           </w:p>
           <w:p>
@@ -1806,7 +2617,71 @@
                 <w:szCs w:val="24"/>
                 <w:shd w:val="clear" w:color="auto" w:fill="F9F9F9"/>
               </w:rPr>
-              <w:t xml:space="preserve">    StructField("Name",StringType(),True), \</w:t>
+              <w:t xml:space="preserve">    </w:t>
+            </w:r>
+            <w:proofErr w:type="spellStart"/>
+            <w:r>
+              <w:rPr>
+                <w:sz w:val="24"/>
+                <w:szCs w:val="24"/>
+                <w:shd w:val="clear" w:color="auto" w:fill="F9F9F9"/>
+              </w:rPr>
+              <w:t>StructField</w:t>
+            </w:r>
+            <w:proofErr w:type="spellEnd"/>
+            <w:r>
+              <w:rPr>
+                <w:sz w:val="24"/>
+                <w:szCs w:val="24"/>
+                <w:shd w:val="clear" w:color="auto" w:fill="F9F9F9"/>
+              </w:rPr>
+              <w:t>("Name</w:t>
+            </w:r>
+            <w:proofErr w:type="gramStart"/>
+            <w:r>
+              <w:rPr>
+                <w:sz w:val="24"/>
+                <w:szCs w:val="24"/>
+                <w:shd w:val="clear" w:color="auto" w:fill="F9F9F9"/>
+              </w:rPr>
+              <w:t>",</w:t>
+            </w:r>
+            <w:proofErr w:type="spellStart"/>
+            <w:r>
+              <w:rPr>
+                <w:sz w:val="24"/>
+                <w:szCs w:val="24"/>
+                <w:shd w:val="clear" w:color="auto" w:fill="F9F9F9"/>
+              </w:rPr>
+              <w:t>StringType</w:t>
+            </w:r>
+            <w:proofErr w:type="spellEnd"/>
+            <w:proofErr w:type="gramEnd"/>
+            <w:r>
+              <w:rPr>
+                <w:sz w:val="24"/>
+                <w:szCs w:val="24"/>
+                <w:shd w:val="clear" w:color="auto" w:fill="F9F9F9"/>
+              </w:rPr>
+              <w:t>(</w:t>
+            </w:r>
+            <w:proofErr w:type="gramStart"/>
+            <w:r>
+              <w:rPr>
+                <w:sz w:val="24"/>
+                <w:szCs w:val="24"/>
+                <w:shd w:val="clear" w:color="auto" w:fill="F9F9F9"/>
+              </w:rPr>
+              <w:t>),True</w:t>
+            </w:r>
+            <w:proofErr w:type="gramEnd"/>
+            <w:r>
+              <w:rPr>
+                <w:sz w:val="24"/>
+                <w:szCs w:val="24"/>
+                <w:shd w:val="clear" w:color="auto" w:fill="F9F9F9"/>
+              </w:rPr>
+              <w:t>), \</w:t>
             </w:r>
           </w:p>
           <w:p>
@@ -1833,7 +2708,71 @@
                 <w:szCs w:val="24"/>
                 <w:shd w:val="clear" w:color="auto" w:fill="F9F9F9"/>
               </w:rPr>
-              <w:t xml:space="preserve">    StructField("Age",IntegerType(),True), \</w:t>
+              <w:t xml:space="preserve">    </w:t>
+            </w:r>
+            <w:proofErr w:type="spellStart"/>
+            <w:r>
+              <w:rPr>
+                <w:sz w:val="24"/>
+                <w:szCs w:val="24"/>
+                <w:shd w:val="clear" w:color="auto" w:fill="F9F9F9"/>
+              </w:rPr>
+              <w:t>StructField</w:t>
+            </w:r>
+            <w:proofErr w:type="spellEnd"/>
+            <w:r>
+              <w:rPr>
+                <w:sz w:val="24"/>
+                <w:szCs w:val="24"/>
+                <w:shd w:val="clear" w:color="auto" w:fill="F9F9F9"/>
+              </w:rPr>
+              <w:t>("Age</w:t>
+            </w:r>
+            <w:proofErr w:type="gramStart"/>
+            <w:r>
+              <w:rPr>
+                <w:sz w:val="24"/>
+                <w:szCs w:val="24"/>
+                <w:shd w:val="clear" w:color="auto" w:fill="F9F9F9"/>
+              </w:rPr>
+              <w:t>",</w:t>
+            </w:r>
+            <w:proofErr w:type="spellStart"/>
+            <w:r>
+              <w:rPr>
+                <w:sz w:val="24"/>
+                <w:szCs w:val="24"/>
+                <w:shd w:val="clear" w:color="auto" w:fill="F9F9F9"/>
+              </w:rPr>
+              <w:t>IntegerType</w:t>
+            </w:r>
+            <w:proofErr w:type="spellEnd"/>
+            <w:proofErr w:type="gramEnd"/>
+            <w:r>
+              <w:rPr>
+                <w:sz w:val="24"/>
+                <w:szCs w:val="24"/>
+                <w:shd w:val="clear" w:color="auto" w:fill="F9F9F9"/>
+              </w:rPr>
+              <w:t>(</w:t>
+            </w:r>
+            <w:proofErr w:type="gramStart"/>
+            <w:r>
+              <w:rPr>
+                <w:sz w:val="24"/>
+                <w:szCs w:val="24"/>
+                <w:shd w:val="clear" w:color="auto" w:fill="F9F9F9"/>
+              </w:rPr>
+              <w:t>),True</w:t>
+            </w:r>
+            <w:proofErr w:type="gramEnd"/>
+            <w:r>
+              <w:rPr>
+                <w:sz w:val="24"/>
+                <w:szCs w:val="24"/>
+                <w:shd w:val="clear" w:color="auto" w:fill="F9F9F9"/>
+              </w:rPr>
+              <w:t>), \</w:t>
             </w:r>
           </w:p>
           <w:p>
@@ -1860,7 +2799,71 @@
                 <w:szCs w:val="24"/>
                 <w:shd w:val="clear" w:color="auto" w:fill="F9F9F9"/>
               </w:rPr>
-              <w:t xml:space="preserve">    StructField("Height",DoubleType(),True), \</w:t>
+              <w:t xml:space="preserve">    </w:t>
+            </w:r>
+            <w:proofErr w:type="spellStart"/>
+            <w:r>
+              <w:rPr>
+                <w:sz w:val="24"/>
+                <w:szCs w:val="24"/>
+                <w:shd w:val="clear" w:color="auto" w:fill="F9F9F9"/>
+              </w:rPr>
+              <w:t>StructField</w:t>
+            </w:r>
+            <w:proofErr w:type="spellEnd"/>
+            <w:r>
+              <w:rPr>
+                <w:sz w:val="24"/>
+                <w:szCs w:val="24"/>
+                <w:shd w:val="clear" w:color="auto" w:fill="F9F9F9"/>
+              </w:rPr>
+              <w:t>("Height</w:t>
+            </w:r>
+            <w:proofErr w:type="gramStart"/>
+            <w:r>
+              <w:rPr>
+                <w:sz w:val="24"/>
+                <w:szCs w:val="24"/>
+                <w:shd w:val="clear" w:color="auto" w:fill="F9F9F9"/>
+              </w:rPr>
+              <w:t>",</w:t>
+            </w:r>
+            <w:proofErr w:type="spellStart"/>
+            <w:r>
+              <w:rPr>
+                <w:sz w:val="24"/>
+                <w:szCs w:val="24"/>
+                <w:shd w:val="clear" w:color="auto" w:fill="F9F9F9"/>
+              </w:rPr>
+              <w:t>DoubleType</w:t>
+            </w:r>
+            <w:proofErr w:type="spellEnd"/>
+            <w:proofErr w:type="gramEnd"/>
+            <w:r>
+              <w:rPr>
+                <w:sz w:val="24"/>
+                <w:szCs w:val="24"/>
+                <w:shd w:val="clear" w:color="auto" w:fill="F9F9F9"/>
+              </w:rPr>
+              <w:t>(</w:t>
+            </w:r>
+            <w:proofErr w:type="gramStart"/>
+            <w:r>
+              <w:rPr>
+                <w:sz w:val="24"/>
+                <w:szCs w:val="24"/>
+                <w:shd w:val="clear" w:color="auto" w:fill="F9F9F9"/>
+              </w:rPr>
+              <w:t>),True</w:t>
+            </w:r>
+            <w:proofErr w:type="gramEnd"/>
+            <w:r>
+              <w:rPr>
+                <w:sz w:val="24"/>
+                <w:szCs w:val="24"/>
+                <w:shd w:val="clear" w:color="auto" w:fill="F9F9F9"/>
+              </w:rPr>
+              <w:t>), \</w:t>
             </w:r>
           </w:p>
           <w:p>
@@ -2087,13 +3090,63 @@
                 <w:shd w:val="clear" w:color="auto" w:fill="F9F9F9"/>
               </w:rPr>
             </w:pPr>
-            <w:r>
-              <w:rPr>
-                <w:sz w:val="24"/>
-                <w:szCs w:val="24"/>
-                <w:shd w:val="clear" w:color="auto" w:fill="F9F9F9"/>
-              </w:rPr>
-              <w:t>df = spark.createDataFrame(data=data,schema=schema)</w:t>
+            <w:proofErr w:type="spellStart"/>
+            <w:r>
+              <w:rPr>
+                <w:sz w:val="24"/>
+                <w:szCs w:val="24"/>
+                <w:shd w:val="clear" w:color="auto" w:fill="F9F9F9"/>
+              </w:rPr>
+              <w:t>df</w:t>
+            </w:r>
+            <w:proofErr w:type="spellEnd"/>
+            <w:r>
+              <w:rPr>
+                <w:sz w:val="24"/>
+                <w:szCs w:val="24"/>
+                <w:shd w:val="clear" w:color="auto" w:fill="F9F9F9"/>
+              </w:rPr>
+              <w:t xml:space="preserve"> = </w:t>
+            </w:r>
+            <w:proofErr w:type="spellStart"/>
+            <w:proofErr w:type="gramStart"/>
+            <w:r>
+              <w:rPr>
+                <w:sz w:val="24"/>
+                <w:szCs w:val="24"/>
+                <w:shd w:val="clear" w:color="auto" w:fill="F9F9F9"/>
+              </w:rPr>
+              <w:t>spark.createDataFrame</w:t>
+            </w:r>
+            <w:proofErr w:type="spellEnd"/>
+            <w:proofErr w:type="gramEnd"/>
+            <w:r>
+              <w:rPr>
+                <w:sz w:val="24"/>
+                <w:szCs w:val="24"/>
+                <w:shd w:val="clear" w:color="auto" w:fill="F9F9F9"/>
+              </w:rPr>
+              <w:t>(data=</w:t>
+            </w:r>
+            <w:proofErr w:type="spellStart"/>
+            <w:proofErr w:type="gramStart"/>
+            <w:r>
+              <w:rPr>
+                <w:sz w:val="24"/>
+                <w:szCs w:val="24"/>
+                <w:shd w:val="clear" w:color="auto" w:fill="F9F9F9"/>
+              </w:rPr>
+              <w:t>data,schema</w:t>
+            </w:r>
+            <w:proofErr w:type="spellEnd"/>
+            <w:proofErr w:type="gramEnd"/>
+            <w:r>
+              <w:rPr>
+                <w:sz w:val="24"/>
+                <w:szCs w:val="24"/>
+                <w:shd w:val="clear" w:color="auto" w:fill="F9F9F9"/>
+              </w:rPr>
+              <w:t>=schema)</w:t>
             </w:r>
           </w:p>
           <w:p>
@@ -2114,13 +3167,25 @@
                 <w:shd w:val="clear" w:color="auto" w:fill="F9F9F9"/>
               </w:rPr>
             </w:pPr>
-            <w:r>
-              <w:rPr>
-                <w:sz w:val="24"/>
-                <w:szCs w:val="24"/>
-                <w:shd w:val="clear" w:color="auto" w:fill="F9F9F9"/>
-              </w:rPr>
-              <w:t>df.printSchema()</w:t>
+            <w:proofErr w:type="spellStart"/>
+            <w:proofErr w:type="gramStart"/>
+            <w:r>
+              <w:rPr>
+                <w:sz w:val="24"/>
+                <w:szCs w:val="24"/>
+                <w:shd w:val="clear" w:color="auto" w:fill="F9F9F9"/>
+              </w:rPr>
+              <w:t>df.printSchema</w:t>
+            </w:r>
+            <w:proofErr w:type="spellEnd"/>
+            <w:proofErr w:type="gramEnd"/>
+            <w:r>
+              <w:rPr>
+                <w:sz w:val="24"/>
+                <w:szCs w:val="24"/>
+                <w:shd w:val="clear" w:color="auto" w:fill="F9F9F9"/>
+              </w:rPr>
+              <w:t>()</w:t>
             </w:r>
           </w:p>
           <w:p>
@@ -2141,6 +3206,8 @@
                 <w:shd w:val="clear" w:color="auto" w:fill="F9F9F9"/>
               </w:rPr>
             </w:pPr>
+            <w:proofErr w:type="spellStart"/>
+            <w:proofErr w:type="gramStart"/>
             <w:r>
               <w:rPr>
                 <w:sz w:val="24"/>
@@ -2148,7 +3215,17 @@
                 <w:shd w:val="clear" w:color="auto" w:fill="F9F9F9"/>
               </w:rPr>
               <w:lastRenderedPageBreak/>
-              <w:t>df.show()</w:t>
+              <w:t>df.show</w:t>
+            </w:r>
+            <w:proofErr w:type="spellEnd"/>
+            <w:proofErr w:type="gramEnd"/>
+            <w:r>
+              <w:rPr>
+                <w:sz w:val="24"/>
+                <w:szCs w:val="24"/>
+                <w:shd w:val="clear" w:color="auto" w:fill="F9F9F9"/>
+              </w:rPr>
+              <w:t>()</w:t>
             </w:r>
           </w:p>
           <w:p>
@@ -2248,7 +3325,29 @@
           <w:szCs w:val="23"/>
           <w:shd w:val="clear" w:color="auto" w:fill="272822"/>
         </w:rPr>
-        <w:t xml:space="preserve"> |-- firstname: string (nullable = true)</w:t>
+        <w:t xml:space="preserve"> |-- </w:t>
+      </w:r>
+      <w:proofErr w:type="spellStart"/>
+      <w:r>
+        <w:rPr>
+          <w:rFonts w:ascii="Consolas" w:eastAsia="Consolas" w:hAnsi="Consolas" w:cs="Consolas"/>
+          <w:color w:val="F8F8F2"/>
+          <w:sz w:val="23"/>
+          <w:szCs w:val="23"/>
+          <w:shd w:val="clear" w:color="auto" w:fill="272822"/>
+        </w:rPr>
+        <w:t>firstname</w:t>
+      </w:r>
+      <w:proofErr w:type="spellEnd"/>
+      <w:r>
+        <w:rPr>
+          <w:rFonts w:ascii="Consolas" w:eastAsia="Consolas" w:hAnsi="Consolas" w:cs="Consolas"/>
+          <w:color w:val="F8F8F2"/>
+          <w:sz w:val="23"/>
+          <w:szCs w:val="23"/>
+          <w:shd w:val="clear" w:color="auto" w:fill="272822"/>
+        </w:rPr>
+        <w:t>: string (nullable = true)</w:t>
       </w:r>
     </w:p>
     <w:p>
@@ -2271,7 +3370,29 @@
           <w:szCs w:val="23"/>
           <w:shd w:val="clear" w:color="auto" w:fill="272822"/>
         </w:rPr>
-        <w:t xml:space="preserve"> |-- middlename: string (nullable = true)</w:t>
+        <w:t xml:space="preserve"> |-- </w:t>
+      </w:r>
+      <w:proofErr w:type="spellStart"/>
+      <w:r>
+        <w:rPr>
+          <w:rFonts w:ascii="Consolas" w:eastAsia="Consolas" w:hAnsi="Consolas" w:cs="Consolas"/>
+          <w:color w:val="F8F8F2"/>
+          <w:sz w:val="23"/>
+          <w:szCs w:val="23"/>
+          <w:shd w:val="clear" w:color="auto" w:fill="272822"/>
+        </w:rPr>
+        <w:t>middlename</w:t>
+      </w:r>
+      <w:proofErr w:type="spellEnd"/>
+      <w:r>
+        <w:rPr>
+          <w:rFonts w:ascii="Consolas" w:eastAsia="Consolas" w:hAnsi="Consolas" w:cs="Consolas"/>
+          <w:color w:val="F8F8F2"/>
+          <w:sz w:val="23"/>
+          <w:szCs w:val="23"/>
+          <w:shd w:val="clear" w:color="auto" w:fill="272822"/>
+        </w:rPr>
+        <w:t>: string (nullable = true)</w:t>
       </w:r>
     </w:p>
     <w:p>
@@ -2294,7 +3415,29 @@
           <w:szCs w:val="23"/>
           <w:shd w:val="clear" w:color="auto" w:fill="272822"/>
         </w:rPr>
-        <w:t xml:space="preserve"> |-- lastname: string (nullable = true)</w:t>
+        <w:t xml:space="preserve"> |-- </w:t>
+      </w:r>
+      <w:proofErr w:type="spellStart"/>
+      <w:r>
+        <w:rPr>
+          <w:rFonts w:ascii="Consolas" w:eastAsia="Consolas" w:hAnsi="Consolas" w:cs="Consolas"/>
+          <w:color w:val="F8F8F2"/>
+          <w:sz w:val="23"/>
+          <w:szCs w:val="23"/>
+          <w:shd w:val="clear" w:color="auto" w:fill="272822"/>
+        </w:rPr>
+        <w:t>lastname</w:t>
+      </w:r>
+      <w:proofErr w:type="spellEnd"/>
+      <w:r>
+        <w:rPr>
+          <w:rFonts w:ascii="Consolas" w:eastAsia="Consolas" w:hAnsi="Consolas" w:cs="Consolas"/>
+          <w:color w:val="F8F8F2"/>
+          <w:sz w:val="23"/>
+          <w:szCs w:val="23"/>
+          <w:shd w:val="clear" w:color="auto" w:fill="272822"/>
+        </w:rPr>
+        <w:t>: string (nullable = true)</w:t>
       </w:r>
     </w:p>
     <w:p>
@@ -2422,7 +3565,51 @@
           <w:szCs w:val="23"/>
           <w:shd w:val="clear" w:color="auto" w:fill="272822"/>
         </w:rPr>
-        <w:t>|firstname|middlename|lastname|id   |gender|salary|</w:t>
+        <w:t>|</w:t>
+      </w:r>
+      <w:proofErr w:type="spellStart"/>
+      <w:r>
+        <w:rPr>
+          <w:rFonts w:ascii="Consolas" w:eastAsia="Consolas" w:hAnsi="Consolas" w:cs="Consolas"/>
+          <w:color w:val="F8F8F2"/>
+          <w:sz w:val="23"/>
+          <w:szCs w:val="23"/>
+          <w:shd w:val="clear" w:color="auto" w:fill="272822"/>
+        </w:rPr>
+        <w:t>firstname|middlename|lastname|id</w:t>
+      </w:r>
+      <w:proofErr w:type="spellEnd"/>
+      <w:r>
+        <w:rPr>
+          <w:rFonts w:ascii="Consolas" w:eastAsia="Consolas" w:hAnsi="Consolas" w:cs="Consolas"/>
+          <w:color w:val="F8F8F2"/>
+          <w:sz w:val="23"/>
+          <w:szCs w:val="23"/>
+          <w:shd w:val="clear" w:color="auto" w:fill="272822"/>
+        </w:rPr>
+        <w:t xml:space="preserve">   |</w:t>
+      </w:r>
+      <w:proofErr w:type="spellStart"/>
+      <w:r>
+        <w:rPr>
+          <w:rFonts w:ascii="Consolas" w:eastAsia="Consolas" w:hAnsi="Consolas" w:cs="Consolas"/>
+          <w:color w:val="F8F8F2"/>
+          <w:sz w:val="23"/>
+          <w:szCs w:val="23"/>
+          <w:shd w:val="clear" w:color="auto" w:fill="272822"/>
+        </w:rPr>
+        <w:t>gender|salary</w:t>
+      </w:r>
+      <w:proofErr w:type="spellEnd"/>
+      <w:r>
+        <w:rPr>
+          <w:rFonts w:ascii="Consolas" w:eastAsia="Consolas" w:hAnsi="Consolas" w:cs="Consolas"/>
+          <w:color w:val="F8F8F2"/>
+          <w:sz w:val="23"/>
+          <w:szCs w:val="23"/>
+          <w:shd w:val="clear" w:color="auto" w:fill="272822"/>
+        </w:rPr>
+        <w:t>|</w:t>
       </w:r>
     </w:p>
     <w:p>
@@ -2490,6 +3677,7 @@
         </w:rPr>
         <w:t>|M     |</w:t>
       </w:r>
+      <w:proofErr w:type="gramStart"/>
       <w:r>
         <w:rPr>
           <w:rFonts w:ascii="Consolas" w:eastAsia="Consolas" w:hAnsi="Consolas" w:cs="Consolas"/>
@@ -2510,6 +3698,7 @@
         </w:rPr>
         <w:t xml:space="preserve">  |</w:t>
       </w:r>
+      <w:proofErr w:type="gramEnd"/>
     </w:p>
     <w:p>
       <w:pPr>
@@ -2531,7 +3720,29 @@
           <w:szCs w:val="23"/>
           <w:shd w:val="clear" w:color="auto" w:fill="272822"/>
         </w:rPr>
-        <w:t>|Michael  |Rose      |        |</w:t>
+        <w:t>|</w:t>
+      </w:r>
+      <w:proofErr w:type="gramStart"/>
+      <w:r>
+        <w:rPr>
+          <w:rFonts w:ascii="Consolas" w:eastAsia="Consolas" w:hAnsi="Consolas" w:cs="Consolas"/>
+          <w:color w:val="F8F8F2"/>
+          <w:sz w:val="23"/>
+          <w:szCs w:val="23"/>
+          <w:shd w:val="clear" w:color="auto" w:fill="272822"/>
+        </w:rPr>
+        <w:t>Michael  |</w:t>
+      </w:r>
+      <w:proofErr w:type="gramEnd"/>
+      <w:r>
+        <w:rPr>
+          <w:rFonts w:ascii="Consolas" w:eastAsia="Consolas" w:hAnsi="Consolas" w:cs="Consolas"/>
+          <w:color w:val="F8F8F2"/>
+          <w:sz w:val="23"/>
+          <w:szCs w:val="23"/>
+          <w:shd w:val="clear" w:color="auto" w:fill="272822"/>
+        </w:rPr>
+        <w:t>Rose      |        |</w:t>
       </w:r>
       <w:r>
         <w:rPr>
@@ -2553,6 +3764,7 @@
         </w:rPr>
         <w:t>|M     |</w:t>
       </w:r>
+      <w:proofErr w:type="gramStart"/>
       <w:r>
         <w:rPr>
           <w:rFonts w:ascii="Consolas" w:eastAsia="Consolas" w:hAnsi="Consolas" w:cs="Consolas"/>
@@ -2573,6 +3785,7 @@
         </w:rPr>
         <w:t xml:space="preserve">  |</w:t>
       </w:r>
+      <w:proofErr w:type="gramEnd"/>
     </w:p>
     <w:p>
       <w:pPr>
@@ -2616,6 +3829,7 @@
         </w:rPr>
         <w:t>|M     |</w:t>
       </w:r>
+      <w:proofErr w:type="gramStart"/>
       <w:r>
         <w:rPr>
           <w:rFonts w:ascii="Consolas" w:eastAsia="Consolas" w:hAnsi="Consolas" w:cs="Consolas"/>
@@ -2636,6 +3850,7 @@
         </w:rPr>
         <w:t xml:space="preserve">  |</w:t>
       </w:r>
+      <w:proofErr w:type="gramEnd"/>
     </w:p>
     <w:p>
       <w:pPr>
@@ -2679,6 +3894,7 @@
         </w:rPr>
         <w:t>|F     |</w:t>
       </w:r>
+      <w:proofErr w:type="gramStart"/>
       <w:r>
         <w:rPr>
           <w:rFonts w:ascii="Consolas" w:eastAsia="Consolas" w:hAnsi="Consolas" w:cs="Consolas"/>
@@ -2699,6 +3915,7 @@
         </w:rPr>
         <w:t xml:space="preserve">  |</w:t>
       </w:r>
+      <w:proofErr w:type="gramEnd"/>
     </w:p>
     <w:p>
       <w:pPr>
@@ -2834,7 +4051,25 @@
           <w:szCs w:val="24"/>
           <w:shd w:val="clear" w:color="auto" w:fill="F9F9F9"/>
         </w:rPr>
-        <w:t>While working on DataFrame we often need to work with the nested struct column and this can be defined using StructType.</w:t>
+        <w:t xml:space="preserve">While working on </w:t>
+      </w:r>
+      <w:proofErr w:type="spellStart"/>
+      <w:r>
+        <w:rPr>
+          <w:sz w:val="24"/>
+          <w:szCs w:val="24"/>
+          <w:shd w:val="clear" w:color="auto" w:fill="F9F9F9"/>
+        </w:rPr>
+        <w:t>DataFrame</w:t>
+      </w:r>
+      <w:proofErr w:type="spellEnd"/>
+      <w:r>
+        <w:rPr>
+          <w:sz w:val="24"/>
+          <w:szCs w:val="24"/>
+          <w:shd w:val="clear" w:color="auto" w:fill="F9F9F9"/>
+        </w:rPr>
+        <w:t xml:space="preserve"> we often need to work with the nested struct column and this can be defined using StructType.</w:t>
       </w:r>
     </w:p>
     <w:p>
@@ -2933,13 +4168,23 @@
                 <w:shd w:val="clear" w:color="auto" w:fill="F9F9F9"/>
               </w:rPr>
             </w:pPr>
-            <w:r>
-              <w:rPr>
-                <w:sz w:val="24"/>
-                <w:szCs w:val="24"/>
-                <w:shd w:val="clear" w:color="auto" w:fill="F9F9F9"/>
-              </w:rPr>
-              <w:t>structureData = [</w:t>
+            <w:proofErr w:type="spellStart"/>
+            <w:r>
+              <w:rPr>
+                <w:sz w:val="24"/>
+                <w:szCs w:val="24"/>
+                <w:shd w:val="clear" w:color="auto" w:fill="F9F9F9"/>
+              </w:rPr>
+              <w:t>structureData</w:t>
+            </w:r>
+            <w:proofErr w:type="spellEnd"/>
+            <w:r>
+              <w:rPr>
+                <w:sz w:val="24"/>
+                <w:szCs w:val="24"/>
+                <w:shd w:val="clear" w:color="auto" w:fill="F9F9F9"/>
+              </w:rPr>
+              <w:t xml:space="preserve"> = [</w:t>
             </w:r>
           </w:p>
           <w:p>
@@ -2966,7 +4211,25 @@
                 <w:szCs w:val="24"/>
                 <w:shd w:val="clear" w:color="auto" w:fill="F9F9F9"/>
               </w:rPr>
-              <w:t xml:space="preserve">    (("James","","Smith"),"36636","M",3100),</w:t>
+              <w:t xml:space="preserve">    (("</w:t>
+            </w:r>
+            <w:proofErr w:type="spellStart"/>
+            <w:r>
+              <w:rPr>
+                <w:sz w:val="24"/>
+                <w:szCs w:val="24"/>
+                <w:shd w:val="clear" w:color="auto" w:fill="F9F9F9"/>
+              </w:rPr>
+              <w:t>James","","Smith</w:t>
+            </w:r>
+            <w:proofErr w:type="spellEnd"/>
+            <w:r>
+              <w:rPr>
+                <w:sz w:val="24"/>
+                <w:szCs w:val="24"/>
+                <w:shd w:val="clear" w:color="auto" w:fill="F9F9F9"/>
+              </w:rPr>
+              <w:t>"),"36636","M",3100),</w:t>
             </w:r>
           </w:p>
           <w:p>
@@ -2993,7 +4256,25 @@
                 <w:szCs w:val="24"/>
                 <w:shd w:val="clear" w:color="auto" w:fill="F9F9F9"/>
               </w:rPr>
-              <w:t xml:space="preserve">    (("Michael","Rose",""),"40288","M",4300),</w:t>
+              <w:t xml:space="preserve">    (("</w:t>
+            </w:r>
+            <w:proofErr w:type="spellStart"/>
+            <w:r>
+              <w:rPr>
+                <w:sz w:val="24"/>
+                <w:szCs w:val="24"/>
+                <w:shd w:val="clear" w:color="auto" w:fill="F9F9F9"/>
+              </w:rPr>
+              <w:t>Michael","Rose</w:t>
+            </w:r>
+            <w:proofErr w:type="spellEnd"/>
+            <w:r>
+              <w:rPr>
+                <w:sz w:val="24"/>
+                <w:szCs w:val="24"/>
+                <w:shd w:val="clear" w:color="auto" w:fill="F9F9F9"/>
+              </w:rPr>
+              <w:t>",""),"40288","M",4300),</w:t>
             </w:r>
           </w:p>
           <w:p>
@@ -3020,7 +4301,25 @@
                 <w:szCs w:val="24"/>
                 <w:shd w:val="clear" w:color="auto" w:fill="F9F9F9"/>
               </w:rPr>
-              <w:t xml:space="preserve">    (("Robert","","Williams"),"42114","M",1400),</w:t>
+              <w:t xml:space="preserve">    (("</w:t>
+            </w:r>
+            <w:proofErr w:type="spellStart"/>
+            <w:r>
+              <w:rPr>
+                <w:sz w:val="24"/>
+                <w:szCs w:val="24"/>
+                <w:shd w:val="clear" w:color="auto" w:fill="F9F9F9"/>
+              </w:rPr>
+              <w:t>Robert","","Williams</w:t>
+            </w:r>
+            <w:proofErr w:type="spellEnd"/>
+            <w:r>
+              <w:rPr>
+                <w:sz w:val="24"/>
+                <w:szCs w:val="24"/>
+                <w:shd w:val="clear" w:color="auto" w:fill="F9F9F9"/>
+              </w:rPr>
+              <w:t>"),"42114","M",1400),</w:t>
             </w:r>
           </w:p>
           <w:p>
@@ -3047,7 +4346,25 @@
                 <w:szCs w:val="24"/>
                 <w:shd w:val="clear" w:color="auto" w:fill="F9F9F9"/>
               </w:rPr>
-              <w:t xml:space="preserve">    (("Maria","Anne","Jones"),"39192","F",5500),</w:t>
+              <w:t xml:space="preserve">    (("</w:t>
+            </w:r>
+            <w:proofErr w:type="spellStart"/>
+            <w:r>
+              <w:rPr>
+                <w:sz w:val="24"/>
+                <w:szCs w:val="24"/>
+                <w:shd w:val="clear" w:color="auto" w:fill="F9F9F9"/>
+              </w:rPr>
+              <w:t>Maria","Anne","Jones</w:t>
+            </w:r>
+            <w:proofErr w:type="spellEnd"/>
+            <w:r>
+              <w:rPr>
+                <w:sz w:val="24"/>
+                <w:szCs w:val="24"/>
+                <w:shd w:val="clear" w:color="auto" w:fill="F9F9F9"/>
+              </w:rPr>
+              <w:t>"),"39192","F",5500),</w:t>
             </w:r>
           </w:p>
           <w:p>
@@ -3074,7 +4391,43 @@
                 <w:szCs w:val="24"/>
                 <w:shd w:val="clear" w:color="auto" w:fill="F9F9F9"/>
               </w:rPr>
-              <w:t xml:space="preserve">    (("Jen","Mary","Brown"),"","F",-1)</w:t>
+              <w:t xml:space="preserve">    (("</w:t>
+            </w:r>
+            <w:proofErr w:type="spellStart"/>
+            <w:r>
+              <w:rPr>
+                <w:sz w:val="24"/>
+                <w:szCs w:val="24"/>
+                <w:shd w:val="clear" w:color="auto" w:fill="F9F9F9"/>
+              </w:rPr>
+              <w:t>Jen","Mary","Brown</w:t>
+            </w:r>
+            <w:proofErr w:type="spellEnd"/>
+            <w:r>
+              <w:rPr>
+                <w:sz w:val="24"/>
+                <w:szCs w:val="24"/>
+                <w:shd w:val="clear" w:color="auto" w:fill="F9F9F9"/>
+              </w:rPr>
+              <w:t>"),"","F</w:t>
+            </w:r>
+            <w:proofErr w:type="gramStart"/>
+            <w:r>
+              <w:rPr>
+                <w:sz w:val="24"/>
+                <w:szCs w:val="24"/>
+                <w:shd w:val="clear" w:color="auto" w:fill="F9F9F9"/>
+              </w:rPr>
+              <w:t>",-</w:t>
+            </w:r>
+            <w:proofErr w:type="gramEnd"/>
+            <w:r>
+              <w:rPr>
+                <w:sz w:val="24"/>
+                <w:szCs w:val="24"/>
+                <w:shd w:val="clear" w:color="auto" w:fill="F9F9F9"/>
+              </w:rPr>
+              <w:t>1)</w:t>
             </w:r>
           </w:p>
           <w:p>
@@ -3122,13 +4475,41 @@
                 <w:shd w:val="clear" w:color="auto" w:fill="F9F9F9"/>
               </w:rPr>
             </w:pPr>
-            <w:r>
-              <w:rPr>
-                <w:sz w:val="24"/>
-                <w:szCs w:val="24"/>
-                <w:shd w:val="clear" w:color="auto" w:fill="F9F9F9"/>
-              </w:rPr>
-              <w:t>structureSchema = StructType([</w:t>
+            <w:proofErr w:type="spellStart"/>
+            <w:r>
+              <w:rPr>
+                <w:sz w:val="24"/>
+                <w:szCs w:val="24"/>
+                <w:shd w:val="clear" w:color="auto" w:fill="F9F9F9"/>
+              </w:rPr>
+              <w:t>structureSchema</w:t>
+            </w:r>
+            <w:proofErr w:type="spellEnd"/>
+            <w:r>
+              <w:rPr>
+                <w:sz w:val="24"/>
+                <w:szCs w:val="24"/>
+                <w:shd w:val="clear" w:color="auto" w:fill="F9F9F9"/>
+              </w:rPr>
+              <w:t xml:space="preserve"> = </w:t>
+            </w:r>
+            <w:proofErr w:type="gramStart"/>
+            <w:r>
+              <w:rPr>
+                <w:sz w:val="24"/>
+                <w:szCs w:val="24"/>
+                <w:shd w:val="clear" w:color="auto" w:fill="F9F9F9"/>
+              </w:rPr>
+              <w:t>StructType(</w:t>
+            </w:r>
+            <w:proofErr w:type="gramEnd"/>
+            <w:r>
+              <w:rPr>
+                <w:sz w:val="24"/>
+                <w:szCs w:val="24"/>
+                <w:shd w:val="clear" w:color="auto" w:fill="F9F9F9"/>
+              </w:rPr>
+              <w:t>[</w:t>
             </w:r>
           </w:p>
           <w:p>
@@ -3155,7 +4536,53 @@
                 <w:szCs w:val="24"/>
                 <w:shd w:val="clear" w:color="auto" w:fill="F9F9F9"/>
               </w:rPr>
-              <w:t xml:space="preserve">        StructField('name', StructType([</w:t>
+              <w:t xml:space="preserve">        </w:t>
+            </w:r>
+            <w:proofErr w:type="spellStart"/>
+            <w:proofErr w:type="gramStart"/>
+            <w:r>
+              <w:rPr>
+                <w:sz w:val="24"/>
+                <w:szCs w:val="24"/>
+                <w:shd w:val="clear" w:color="auto" w:fill="F9F9F9"/>
+              </w:rPr>
+              <w:t>StructField</w:t>
+            </w:r>
+            <w:proofErr w:type="spellEnd"/>
+            <w:r>
+              <w:rPr>
+                <w:sz w:val="24"/>
+                <w:szCs w:val="24"/>
+                <w:shd w:val="clear" w:color="auto" w:fill="F9F9F9"/>
+              </w:rPr>
+              <w:t>(</w:t>
+            </w:r>
+            <w:proofErr w:type="gramEnd"/>
+            <w:r>
+              <w:rPr>
+                <w:sz w:val="24"/>
+                <w:szCs w:val="24"/>
+                <w:shd w:val="clear" w:color="auto" w:fill="F9F9F9"/>
+              </w:rPr>
+              <w:t xml:space="preserve">'name', </w:t>
+            </w:r>
+            <w:proofErr w:type="gramStart"/>
+            <w:r>
+              <w:rPr>
+                <w:sz w:val="24"/>
+                <w:szCs w:val="24"/>
+                <w:shd w:val="clear" w:color="auto" w:fill="F9F9F9"/>
+              </w:rPr>
+              <w:t>StructType(</w:t>
+            </w:r>
+            <w:proofErr w:type="gramEnd"/>
+            <w:r>
+              <w:rPr>
+                <w:sz w:val="24"/>
+                <w:szCs w:val="24"/>
+                <w:shd w:val="clear" w:color="auto" w:fill="F9F9F9"/>
+              </w:rPr>
+              <w:t>[</w:t>
             </w:r>
           </w:p>
           <w:p>
@@ -3182,7 +4609,81 @@
                 <w:szCs w:val="24"/>
                 <w:shd w:val="clear" w:color="auto" w:fill="F9F9F9"/>
               </w:rPr>
-              <w:t xml:space="preserve">             StructField('firstname', StringType(), True),</w:t>
+              <w:t xml:space="preserve">             </w:t>
+            </w:r>
+            <w:proofErr w:type="spellStart"/>
+            <w:proofErr w:type="gramStart"/>
+            <w:r>
+              <w:rPr>
+                <w:sz w:val="24"/>
+                <w:szCs w:val="24"/>
+                <w:shd w:val="clear" w:color="auto" w:fill="F9F9F9"/>
+              </w:rPr>
+              <w:t>StructField</w:t>
+            </w:r>
+            <w:proofErr w:type="spellEnd"/>
+            <w:r>
+              <w:rPr>
+                <w:sz w:val="24"/>
+                <w:szCs w:val="24"/>
+                <w:shd w:val="clear" w:color="auto" w:fill="F9F9F9"/>
+              </w:rPr>
+              <w:t>(</w:t>
+            </w:r>
+            <w:proofErr w:type="gramEnd"/>
+            <w:r>
+              <w:rPr>
+                <w:sz w:val="24"/>
+                <w:szCs w:val="24"/>
+                <w:shd w:val="clear" w:color="auto" w:fill="F9F9F9"/>
+              </w:rPr>
+              <w:t>'</w:t>
+            </w:r>
+            <w:proofErr w:type="spellStart"/>
+            <w:r>
+              <w:rPr>
+                <w:sz w:val="24"/>
+                <w:szCs w:val="24"/>
+                <w:shd w:val="clear" w:color="auto" w:fill="F9F9F9"/>
+              </w:rPr>
+              <w:t>firstname</w:t>
+            </w:r>
+            <w:proofErr w:type="spellEnd"/>
+            <w:r>
+              <w:rPr>
+                <w:sz w:val="24"/>
+                <w:szCs w:val="24"/>
+                <w:shd w:val="clear" w:color="auto" w:fill="F9F9F9"/>
+              </w:rPr>
+              <w:t xml:space="preserve">', </w:t>
+            </w:r>
+            <w:proofErr w:type="spellStart"/>
+            <w:proofErr w:type="gramStart"/>
+            <w:r>
+              <w:rPr>
+                <w:sz w:val="24"/>
+                <w:szCs w:val="24"/>
+                <w:shd w:val="clear" w:color="auto" w:fill="F9F9F9"/>
+              </w:rPr>
+              <w:t>StringType</w:t>
+            </w:r>
+            <w:proofErr w:type="spellEnd"/>
+            <w:r>
+              <w:rPr>
+                <w:sz w:val="24"/>
+                <w:szCs w:val="24"/>
+                <w:shd w:val="clear" w:color="auto" w:fill="F9F9F9"/>
+              </w:rPr>
+              <w:t>(</w:t>
+            </w:r>
+            <w:proofErr w:type="gramEnd"/>
+            <w:r>
+              <w:rPr>
+                <w:sz w:val="24"/>
+                <w:szCs w:val="24"/>
+                <w:shd w:val="clear" w:color="auto" w:fill="F9F9F9"/>
+              </w:rPr>
+              <w:t>), True),</w:t>
             </w:r>
           </w:p>
           <w:p>
@@ -3209,7 +4710,81 @@
                 <w:szCs w:val="24"/>
                 <w:shd w:val="clear" w:color="auto" w:fill="F9F9F9"/>
               </w:rPr>
-              <w:t xml:space="preserve">             StructField('middlename', StringType(), True),</w:t>
+              <w:t xml:space="preserve">             </w:t>
+            </w:r>
+            <w:proofErr w:type="spellStart"/>
+            <w:proofErr w:type="gramStart"/>
+            <w:r>
+              <w:rPr>
+                <w:sz w:val="24"/>
+                <w:szCs w:val="24"/>
+                <w:shd w:val="clear" w:color="auto" w:fill="F9F9F9"/>
+              </w:rPr>
+              <w:t>StructField</w:t>
+            </w:r>
+            <w:proofErr w:type="spellEnd"/>
+            <w:r>
+              <w:rPr>
+                <w:sz w:val="24"/>
+                <w:szCs w:val="24"/>
+                <w:shd w:val="clear" w:color="auto" w:fill="F9F9F9"/>
+              </w:rPr>
+              <w:t>(</w:t>
+            </w:r>
+            <w:proofErr w:type="gramEnd"/>
+            <w:r>
+              <w:rPr>
+                <w:sz w:val="24"/>
+                <w:szCs w:val="24"/>
+                <w:shd w:val="clear" w:color="auto" w:fill="F9F9F9"/>
+              </w:rPr>
+              <w:t>'</w:t>
+            </w:r>
+            <w:proofErr w:type="spellStart"/>
+            <w:r>
+              <w:rPr>
+                <w:sz w:val="24"/>
+                <w:szCs w:val="24"/>
+                <w:shd w:val="clear" w:color="auto" w:fill="F9F9F9"/>
+              </w:rPr>
+              <w:t>middlename</w:t>
+            </w:r>
+            <w:proofErr w:type="spellEnd"/>
+            <w:r>
+              <w:rPr>
+                <w:sz w:val="24"/>
+                <w:szCs w:val="24"/>
+                <w:shd w:val="clear" w:color="auto" w:fill="F9F9F9"/>
+              </w:rPr>
+              <w:t xml:space="preserve">', </w:t>
+            </w:r>
+            <w:proofErr w:type="spellStart"/>
+            <w:proofErr w:type="gramStart"/>
+            <w:r>
+              <w:rPr>
+                <w:sz w:val="24"/>
+                <w:szCs w:val="24"/>
+                <w:shd w:val="clear" w:color="auto" w:fill="F9F9F9"/>
+              </w:rPr>
+              <w:t>StringType</w:t>
+            </w:r>
+            <w:proofErr w:type="spellEnd"/>
+            <w:r>
+              <w:rPr>
+                <w:sz w:val="24"/>
+                <w:szCs w:val="24"/>
+                <w:shd w:val="clear" w:color="auto" w:fill="F9F9F9"/>
+              </w:rPr>
+              <w:t>(</w:t>
+            </w:r>
+            <w:proofErr w:type="gramEnd"/>
+            <w:r>
+              <w:rPr>
+                <w:sz w:val="24"/>
+                <w:szCs w:val="24"/>
+                <w:shd w:val="clear" w:color="auto" w:fill="F9F9F9"/>
+              </w:rPr>
+              <w:t>), True),</w:t>
             </w:r>
           </w:p>
           <w:p>
@@ -3236,7 +4811,81 @@
                 <w:szCs w:val="24"/>
                 <w:shd w:val="clear" w:color="auto" w:fill="F9F9F9"/>
               </w:rPr>
-              <w:t xml:space="preserve">             StructField('lastname', StringType(), True)</w:t>
+              <w:t xml:space="preserve">             </w:t>
+            </w:r>
+            <w:proofErr w:type="spellStart"/>
+            <w:proofErr w:type="gramStart"/>
+            <w:r>
+              <w:rPr>
+                <w:sz w:val="24"/>
+                <w:szCs w:val="24"/>
+                <w:shd w:val="clear" w:color="auto" w:fill="F9F9F9"/>
+              </w:rPr>
+              <w:t>StructField</w:t>
+            </w:r>
+            <w:proofErr w:type="spellEnd"/>
+            <w:r>
+              <w:rPr>
+                <w:sz w:val="24"/>
+                <w:szCs w:val="24"/>
+                <w:shd w:val="clear" w:color="auto" w:fill="F9F9F9"/>
+              </w:rPr>
+              <w:t>(</w:t>
+            </w:r>
+            <w:proofErr w:type="gramEnd"/>
+            <w:r>
+              <w:rPr>
+                <w:sz w:val="24"/>
+                <w:szCs w:val="24"/>
+                <w:shd w:val="clear" w:color="auto" w:fill="F9F9F9"/>
+              </w:rPr>
+              <w:t>'</w:t>
+            </w:r>
+            <w:proofErr w:type="spellStart"/>
+            <w:r>
+              <w:rPr>
+                <w:sz w:val="24"/>
+                <w:szCs w:val="24"/>
+                <w:shd w:val="clear" w:color="auto" w:fill="F9F9F9"/>
+              </w:rPr>
+              <w:t>lastname</w:t>
+            </w:r>
+            <w:proofErr w:type="spellEnd"/>
+            <w:r>
+              <w:rPr>
+                <w:sz w:val="24"/>
+                <w:szCs w:val="24"/>
+                <w:shd w:val="clear" w:color="auto" w:fill="F9F9F9"/>
+              </w:rPr>
+              <w:t xml:space="preserve">', </w:t>
+            </w:r>
+            <w:proofErr w:type="spellStart"/>
+            <w:proofErr w:type="gramStart"/>
+            <w:r>
+              <w:rPr>
+                <w:sz w:val="24"/>
+                <w:szCs w:val="24"/>
+                <w:shd w:val="clear" w:color="auto" w:fill="F9F9F9"/>
+              </w:rPr>
+              <w:t>StringType</w:t>
+            </w:r>
+            <w:proofErr w:type="spellEnd"/>
+            <w:r>
+              <w:rPr>
+                <w:sz w:val="24"/>
+                <w:szCs w:val="24"/>
+                <w:shd w:val="clear" w:color="auto" w:fill="F9F9F9"/>
+              </w:rPr>
+              <w:t>(</w:t>
+            </w:r>
+            <w:proofErr w:type="gramEnd"/>
+            <w:r>
+              <w:rPr>
+                <w:sz w:val="24"/>
+                <w:szCs w:val="24"/>
+                <w:shd w:val="clear" w:color="auto" w:fill="F9F9F9"/>
+              </w:rPr>
+              <w:t>), True)</w:t>
             </w:r>
           </w:p>
           <w:p>
@@ -3291,7 +4940,63 @@
                 <w:shd w:val="clear" w:color="auto" w:fill="F9F9F9"/>
               </w:rPr>
               <w:lastRenderedPageBreak/>
-              <w:t xml:space="preserve">         StructField('id', StringType(), True),</w:t>
+              <w:t xml:space="preserve">         </w:t>
+            </w:r>
+            <w:proofErr w:type="spellStart"/>
+            <w:proofErr w:type="gramStart"/>
+            <w:r>
+              <w:rPr>
+                <w:sz w:val="24"/>
+                <w:szCs w:val="24"/>
+                <w:shd w:val="clear" w:color="auto" w:fill="F9F9F9"/>
+              </w:rPr>
+              <w:t>StructField</w:t>
+            </w:r>
+            <w:proofErr w:type="spellEnd"/>
+            <w:r>
+              <w:rPr>
+                <w:sz w:val="24"/>
+                <w:szCs w:val="24"/>
+                <w:shd w:val="clear" w:color="auto" w:fill="F9F9F9"/>
+              </w:rPr>
+              <w:t>(</w:t>
+            </w:r>
+            <w:proofErr w:type="gramEnd"/>
+            <w:r>
+              <w:rPr>
+                <w:sz w:val="24"/>
+                <w:szCs w:val="24"/>
+                <w:shd w:val="clear" w:color="auto" w:fill="F9F9F9"/>
+              </w:rPr>
+              <w:t xml:space="preserve">'id', </w:t>
+            </w:r>
+            <w:proofErr w:type="spellStart"/>
+            <w:proofErr w:type="gramStart"/>
+            <w:r>
+              <w:rPr>
+                <w:sz w:val="24"/>
+                <w:szCs w:val="24"/>
+                <w:shd w:val="clear" w:color="auto" w:fill="F9F9F9"/>
+              </w:rPr>
+              <w:t>StringType</w:t>
+            </w:r>
+            <w:proofErr w:type="spellEnd"/>
+            <w:r>
+              <w:rPr>
+                <w:sz w:val="24"/>
+                <w:szCs w:val="24"/>
+                <w:shd w:val="clear" w:color="auto" w:fill="F9F9F9"/>
+              </w:rPr>
+              <w:t>(</w:t>
+            </w:r>
+            <w:proofErr w:type="gramEnd"/>
+            <w:r>
+              <w:rPr>
+                <w:sz w:val="24"/>
+                <w:szCs w:val="24"/>
+                <w:shd w:val="clear" w:color="auto" w:fill="F9F9F9"/>
+              </w:rPr>
+              <w:t>), True),</w:t>
             </w:r>
           </w:p>
           <w:p>
@@ -3318,7 +5023,63 @@
                 <w:szCs w:val="24"/>
                 <w:shd w:val="clear" w:color="auto" w:fill="F9F9F9"/>
               </w:rPr>
-              <w:t xml:space="preserve">         StructField('gender', StringType(), True),</w:t>
+              <w:t xml:space="preserve">         </w:t>
+            </w:r>
+            <w:proofErr w:type="spellStart"/>
+            <w:proofErr w:type="gramStart"/>
+            <w:r>
+              <w:rPr>
+                <w:sz w:val="24"/>
+                <w:szCs w:val="24"/>
+                <w:shd w:val="clear" w:color="auto" w:fill="F9F9F9"/>
+              </w:rPr>
+              <w:t>StructField</w:t>
+            </w:r>
+            <w:proofErr w:type="spellEnd"/>
+            <w:r>
+              <w:rPr>
+                <w:sz w:val="24"/>
+                <w:szCs w:val="24"/>
+                <w:shd w:val="clear" w:color="auto" w:fill="F9F9F9"/>
+              </w:rPr>
+              <w:t>(</w:t>
+            </w:r>
+            <w:proofErr w:type="gramEnd"/>
+            <w:r>
+              <w:rPr>
+                <w:sz w:val="24"/>
+                <w:szCs w:val="24"/>
+                <w:shd w:val="clear" w:color="auto" w:fill="F9F9F9"/>
+              </w:rPr>
+              <w:t xml:space="preserve">'gender', </w:t>
+            </w:r>
+            <w:proofErr w:type="spellStart"/>
+            <w:proofErr w:type="gramStart"/>
+            <w:r>
+              <w:rPr>
+                <w:sz w:val="24"/>
+                <w:szCs w:val="24"/>
+                <w:shd w:val="clear" w:color="auto" w:fill="F9F9F9"/>
+              </w:rPr>
+              <w:t>StringType</w:t>
+            </w:r>
+            <w:proofErr w:type="spellEnd"/>
+            <w:r>
+              <w:rPr>
+                <w:sz w:val="24"/>
+                <w:szCs w:val="24"/>
+                <w:shd w:val="clear" w:color="auto" w:fill="F9F9F9"/>
+              </w:rPr>
+              <w:t>(</w:t>
+            </w:r>
+            <w:proofErr w:type="gramEnd"/>
+            <w:r>
+              <w:rPr>
+                <w:sz w:val="24"/>
+                <w:szCs w:val="24"/>
+                <w:shd w:val="clear" w:color="auto" w:fill="F9F9F9"/>
+              </w:rPr>
+              <w:t>), True),</w:t>
             </w:r>
           </w:p>
           <w:p>
@@ -3345,7 +5106,63 @@
                 <w:szCs w:val="24"/>
                 <w:shd w:val="clear" w:color="auto" w:fill="F9F9F9"/>
               </w:rPr>
-              <w:t xml:space="preserve">         StructField('salary', IntegerType(), True)</w:t>
+              <w:t xml:space="preserve">         </w:t>
+            </w:r>
+            <w:proofErr w:type="spellStart"/>
+            <w:proofErr w:type="gramStart"/>
+            <w:r>
+              <w:rPr>
+                <w:sz w:val="24"/>
+                <w:szCs w:val="24"/>
+                <w:shd w:val="clear" w:color="auto" w:fill="F9F9F9"/>
+              </w:rPr>
+              <w:t>StructField</w:t>
+            </w:r>
+            <w:proofErr w:type="spellEnd"/>
+            <w:r>
+              <w:rPr>
+                <w:sz w:val="24"/>
+                <w:szCs w:val="24"/>
+                <w:shd w:val="clear" w:color="auto" w:fill="F9F9F9"/>
+              </w:rPr>
+              <w:t>(</w:t>
+            </w:r>
+            <w:proofErr w:type="gramEnd"/>
+            <w:r>
+              <w:rPr>
+                <w:sz w:val="24"/>
+                <w:szCs w:val="24"/>
+                <w:shd w:val="clear" w:color="auto" w:fill="F9F9F9"/>
+              </w:rPr>
+              <w:t xml:space="preserve">'salary', </w:t>
+            </w:r>
+            <w:proofErr w:type="spellStart"/>
+            <w:proofErr w:type="gramStart"/>
+            <w:r>
+              <w:rPr>
+                <w:sz w:val="24"/>
+                <w:szCs w:val="24"/>
+                <w:shd w:val="clear" w:color="auto" w:fill="F9F9F9"/>
+              </w:rPr>
+              <w:t>IntegerType</w:t>
+            </w:r>
+            <w:proofErr w:type="spellEnd"/>
+            <w:r>
+              <w:rPr>
+                <w:sz w:val="24"/>
+                <w:szCs w:val="24"/>
+                <w:shd w:val="clear" w:color="auto" w:fill="F9F9F9"/>
+              </w:rPr>
+              <w:t>(</w:t>
+            </w:r>
+            <w:proofErr w:type="gramEnd"/>
+            <w:r>
+              <w:rPr>
+                <w:sz w:val="24"/>
+                <w:szCs w:val="24"/>
+                <w:shd w:val="clear" w:color="auto" w:fill="F9F9F9"/>
+              </w:rPr>
+              <w:t>), True)</w:t>
             </w:r>
           </w:p>
           <w:p>
@@ -3418,7 +5235,65 @@
                 <w:szCs w:val="24"/>
                 <w:shd w:val="clear" w:color="auto" w:fill="F9F9F9"/>
               </w:rPr>
-              <w:t>df2 = spark.createDataFrame(data=structureData,schema=structureSchema)</w:t>
+              <w:t xml:space="preserve">df2 = </w:t>
+            </w:r>
+            <w:proofErr w:type="spellStart"/>
+            <w:proofErr w:type="gramStart"/>
+            <w:r>
+              <w:rPr>
+                <w:sz w:val="24"/>
+                <w:szCs w:val="24"/>
+                <w:shd w:val="clear" w:color="auto" w:fill="F9F9F9"/>
+              </w:rPr>
+              <w:t>spark.createDataFrame</w:t>
+            </w:r>
+            <w:proofErr w:type="spellEnd"/>
+            <w:proofErr w:type="gramEnd"/>
+            <w:r>
+              <w:rPr>
+                <w:sz w:val="24"/>
+                <w:szCs w:val="24"/>
+                <w:shd w:val="clear" w:color="auto" w:fill="F9F9F9"/>
+              </w:rPr>
+              <w:t>(data=</w:t>
+            </w:r>
+            <w:proofErr w:type="spellStart"/>
+            <w:proofErr w:type="gramStart"/>
+            <w:r>
+              <w:rPr>
+                <w:sz w:val="24"/>
+                <w:szCs w:val="24"/>
+                <w:shd w:val="clear" w:color="auto" w:fill="F9F9F9"/>
+              </w:rPr>
+              <w:t>structureData,schema</w:t>
+            </w:r>
+            <w:proofErr w:type="spellEnd"/>
+            <w:proofErr w:type="gramEnd"/>
+            <w:r>
+              <w:rPr>
+                <w:sz w:val="24"/>
+                <w:szCs w:val="24"/>
+                <w:shd w:val="clear" w:color="auto" w:fill="F9F9F9"/>
+              </w:rPr>
+              <w:t>=</w:t>
+            </w:r>
+            <w:proofErr w:type="spellStart"/>
+            <w:r>
+              <w:rPr>
+                <w:sz w:val="24"/>
+                <w:szCs w:val="24"/>
+                <w:shd w:val="clear" w:color="auto" w:fill="F9F9F9"/>
+              </w:rPr>
+              <w:t>structureSchema</w:t>
+            </w:r>
+            <w:proofErr w:type="spellEnd"/>
+            <w:r>
+              <w:rPr>
+                <w:sz w:val="24"/>
+                <w:szCs w:val="24"/>
+                <w:shd w:val="clear" w:color="auto" w:fill="F9F9F9"/>
+              </w:rPr>
+              <w:t>)</w:t>
             </w:r>
           </w:p>
           <w:p>
@@ -3593,7 +5468,29 @@
           <w:szCs w:val="23"/>
           <w:shd w:val="clear" w:color="auto" w:fill="272822"/>
         </w:rPr>
-        <w:t xml:space="preserve"> |    |-- firstname: string (nullable = true)</w:t>
+        <w:t xml:space="preserve"> |    |-- </w:t>
+      </w:r>
+      <w:proofErr w:type="spellStart"/>
+      <w:r>
+        <w:rPr>
+          <w:rFonts w:ascii="Consolas" w:eastAsia="Consolas" w:hAnsi="Consolas" w:cs="Consolas"/>
+          <w:color w:val="F8F8F2"/>
+          <w:sz w:val="23"/>
+          <w:szCs w:val="23"/>
+          <w:shd w:val="clear" w:color="auto" w:fill="272822"/>
+        </w:rPr>
+        <w:t>firstname</w:t>
+      </w:r>
+      <w:proofErr w:type="spellEnd"/>
+      <w:r>
+        <w:rPr>
+          <w:rFonts w:ascii="Consolas" w:eastAsia="Consolas" w:hAnsi="Consolas" w:cs="Consolas"/>
+          <w:color w:val="F8F8F2"/>
+          <w:sz w:val="23"/>
+          <w:szCs w:val="23"/>
+          <w:shd w:val="clear" w:color="auto" w:fill="272822"/>
+        </w:rPr>
+        <w:t>: string (nullable = true)</w:t>
       </w:r>
     </w:p>
     <w:p>
@@ -3616,7 +5513,29 @@
           <w:szCs w:val="23"/>
           <w:shd w:val="clear" w:color="auto" w:fill="272822"/>
         </w:rPr>
-        <w:t xml:space="preserve"> |    |-- middlename: string (nullable = true)</w:t>
+        <w:t xml:space="preserve"> |    |-- </w:t>
+      </w:r>
+      <w:proofErr w:type="spellStart"/>
+      <w:r>
+        <w:rPr>
+          <w:rFonts w:ascii="Consolas" w:eastAsia="Consolas" w:hAnsi="Consolas" w:cs="Consolas"/>
+          <w:color w:val="F8F8F2"/>
+          <w:sz w:val="23"/>
+          <w:szCs w:val="23"/>
+          <w:shd w:val="clear" w:color="auto" w:fill="272822"/>
+        </w:rPr>
+        <w:t>middlename</w:t>
+      </w:r>
+      <w:proofErr w:type="spellEnd"/>
+      <w:r>
+        <w:rPr>
+          <w:rFonts w:ascii="Consolas" w:eastAsia="Consolas" w:hAnsi="Consolas" w:cs="Consolas"/>
+          <w:color w:val="F8F8F2"/>
+          <w:sz w:val="23"/>
+          <w:szCs w:val="23"/>
+          <w:shd w:val="clear" w:color="auto" w:fill="272822"/>
+        </w:rPr>
+        <w:t>: string (nullable = true)</w:t>
       </w:r>
     </w:p>
     <w:p>
@@ -3639,7 +5558,29 @@
           <w:szCs w:val="23"/>
           <w:shd w:val="clear" w:color="auto" w:fill="272822"/>
         </w:rPr>
-        <w:t xml:space="preserve"> |    |-- lastname: string (nullable = true)</w:t>
+        <w:t xml:space="preserve"> |    |-- </w:t>
+      </w:r>
+      <w:proofErr w:type="spellStart"/>
+      <w:r>
+        <w:rPr>
+          <w:rFonts w:ascii="Consolas" w:eastAsia="Consolas" w:hAnsi="Consolas" w:cs="Consolas"/>
+          <w:color w:val="F8F8F2"/>
+          <w:sz w:val="23"/>
+          <w:szCs w:val="23"/>
+          <w:shd w:val="clear" w:color="auto" w:fill="272822"/>
+        </w:rPr>
+        <w:t>lastname</w:t>
+      </w:r>
+      <w:proofErr w:type="spellEnd"/>
+      <w:r>
+        <w:rPr>
+          <w:rFonts w:ascii="Consolas" w:eastAsia="Consolas" w:hAnsi="Consolas" w:cs="Consolas"/>
+          <w:color w:val="F8F8F2"/>
+          <w:sz w:val="23"/>
+          <w:szCs w:val="23"/>
+          <w:shd w:val="clear" w:color="auto" w:fill="272822"/>
+        </w:rPr>
+        <w:t>: string (nullable = true)</w:t>
       </w:r>
     </w:p>
     <w:p>
@@ -3767,7 +5708,29 @@
           <w:szCs w:val="23"/>
           <w:shd w:val="clear" w:color="auto" w:fill="272822"/>
         </w:rPr>
-        <w:t>|name                |id   |gender|salary|</w:t>
+        <w:t>|name                |id   |</w:t>
+      </w:r>
+      <w:proofErr w:type="spellStart"/>
+      <w:r>
+        <w:rPr>
+          <w:rFonts w:ascii="Consolas" w:eastAsia="Consolas" w:hAnsi="Consolas" w:cs="Consolas"/>
+          <w:color w:val="F8F8F2"/>
+          <w:sz w:val="23"/>
+          <w:szCs w:val="23"/>
+          <w:shd w:val="clear" w:color="auto" w:fill="272822"/>
+        </w:rPr>
+        <w:t>gender|salary</w:t>
+      </w:r>
+      <w:proofErr w:type="spellEnd"/>
+      <w:r>
+        <w:rPr>
+          <w:rFonts w:ascii="Consolas" w:eastAsia="Consolas" w:hAnsi="Consolas" w:cs="Consolas"/>
+          <w:color w:val="F8F8F2"/>
+          <w:sz w:val="23"/>
+          <w:szCs w:val="23"/>
+          <w:shd w:val="clear" w:color="auto" w:fill="272822"/>
+        </w:rPr>
+        <w:t>|</w:t>
       </w:r>
     </w:p>
     <w:p>
@@ -3805,15 +5768,71 @@
           <w:shd w:val="clear" w:color="auto" w:fill="272822"/>
         </w:rPr>
       </w:pPr>
-      <w:r>
-        <w:rPr>
-          <w:rFonts w:ascii="Consolas" w:eastAsia="Consolas" w:hAnsi="Consolas" w:cs="Consolas"/>
-          <w:color w:val="F8F8F2"/>
-          <w:sz w:val="23"/>
-          <w:szCs w:val="23"/>
-          <w:shd w:val="clear" w:color="auto" w:fill="272822"/>
-        </w:rPr>
-        <w:t>|[James, , Smith]    |</w:t>
+      <w:proofErr w:type="gramStart"/>
+      <w:r>
+        <w:rPr>
+          <w:rFonts w:ascii="Consolas" w:eastAsia="Consolas" w:hAnsi="Consolas" w:cs="Consolas"/>
+          <w:color w:val="F8F8F2"/>
+          <w:sz w:val="23"/>
+          <w:szCs w:val="23"/>
+          <w:shd w:val="clear" w:color="auto" w:fill="272822"/>
+        </w:rPr>
+        <w:t>|[</w:t>
+      </w:r>
+      <w:proofErr w:type="gramEnd"/>
+      <w:r>
+        <w:rPr>
+          <w:rFonts w:ascii="Consolas" w:eastAsia="Consolas" w:hAnsi="Consolas" w:cs="Consolas"/>
+          <w:color w:val="F8F8F2"/>
+          <w:sz w:val="23"/>
+          <w:szCs w:val="23"/>
+          <w:shd w:val="clear" w:color="auto" w:fill="272822"/>
+        </w:rPr>
+        <w:t>James</w:t>
+      </w:r>
+      <w:proofErr w:type="gramStart"/>
+      <w:r>
+        <w:rPr>
+          <w:rFonts w:ascii="Consolas" w:eastAsia="Consolas" w:hAnsi="Consolas" w:cs="Consolas"/>
+          <w:color w:val="F8F8F2"/>
+          <w:sz w:val="23"/>
+          <w:szCs w:val="23"/>
+          <w:shd w:val="clear" w:color="auto" w:fill="272822"/>
+        </w:rPr>
+        <w:t>, ,</w:t>
+      </w:r>
+      <w:proofErr w:type="gramEnd"/>
+      <w:r>
+        <w:rPr>
+          <w:rFonts w:ascii="Consolas" w:eastAsia="Consolas" w:hAnsi="Consolas" w:cs="Consolas"/>
+          <w:color w:val="F8F8F2"/>
+          <w:sz w:val="23"/>
+          <w:szCs w:val="23"/>
+          <w:shd w:val="clear" w:color="auto" w:fill="272822"/>
+        </w:rPr>
+        <w:t xml:space="preserve"> </w:t>
+      </w:r>
+      <w:proofErr w:type="gramStart"/>
+      <w:r>
+        <w:rPr>
+          <w:rFonts w:ascii="Consolas" w:eastAsia="Consolas" w:hAnsi="Consolas" w:cs="Consolas"/>
+          <w:color w:val="F8F8F2"/>
+          <w:sz w:val="23"/>
+          <w:szCs w:val="23"/>
+          <w:shd w:val="clear" w:color="auto" w:fill="272822"/>
+        </w:rPr>
+        <w:t xml:space="preserve">Smith]   </w:t>
+      </w:r>
+      <w:proofErr w:type="gramEnd"/>
+      <w:r>
+        <w:rPr>
+          <w:rFonts w:ascii="Consolas" w:eastAsia="Consolas" w:hAnsi="Consolas" w:cs="Consolas"/>
+          <w:color w:val="F8F8F2"/>
+          <w:sz w:val="23"/>
+          <w:szCs w:val="23"/>
+          <w:shd w:val="clear" w:color="auto" w:fill="272822"/>
+        </w:rPr>
+        <w:t xml:space="preserve"> |</w:t>
       </w:r>
       <w:r>
         <w:rPr>
@@ -3835,6 +5854,7 @@
         </w:rPr>
         <w:t>|M     |</w:t>
       </w:r>
+      <w:proofErr w:type="gramStart"/>
       <w:r>
         <w:rPr>
           <w:rFonts w:ascii="Consolas" w:eastAsia="Consolas" w:hAnsi="Consolas" w:cs="Consolas"/>
@@ -3855,6 +5875,7 @@
         </w:rPr>
         <w:t xml:space="preserve">  |</w:t>
       </w:r>
+      <w:proofErr w:type="gramEnd"/>
     </w:p>
     <w:p>
       <w:pPr>
@@ -3868,15 +5889,49 @@
           <w:shd w:val="clear" w:color="auto" w:fill="272822"/>
         </w:rPr>
       </w:pPr>
-      <w:r>
-        <w:rPr>
-          <w:rFonts w:ascii="Consolas" w:eastAsia="Consolas" w:hAnsi="Consolas" w:cs="Consolas"/>
-          <w:color w:val="F8F8F2"/>
-          <w:sz w:val="23"/>
-          <w:szCs w:val="23"/>
-          <w:shd w:val="clear" w:color="auto" w:fill="272822"/>
-        </w:rPr>
-        <w:t>|[Michael, Rose, ]   |</w:t>
+      <w:proofErr w:type="gramStart"/>
+      <w:r>
+        <w:rPr>
+          <w:rFonts w:ascii="Consolas" w:eastAsia="Consolas" w:hAnsi="Consolas" w:cs="Consolas"/>
+          <w:color w:val="F8F8F2"/>
+          <w:sz w:val="23"/>
+          <w:szCs w:val="23"/>
+          <w:shd w:val="clear" w:color="auto" w:fill="272822"/>
+        </w:rPr>
+        <w:t>|[</w:t>
+      </w:r>
+      <w:proofErr w:type="gramEnd"/>
+      <w:r>
+        <w:rPr>
+          <w:rFonts w:ascii="Consolas" w:eastAsia="Consolas" w:hAnsi="Consolas" w:cs="Consolas"/>
+          <w:color w:val="F8F8F2"/>
+          <w:sz w:val="23"/>
+          <w:szCs w:val="23"/>
+          <w:shd w:val="clear" w:color="auto" w:fill="272822"/>
+        </w:rPr>
+        <w:t>Michael, Rose</w:t>
+      </w:r>
+      <w:proofErr w:type="gramStart"/>
+      <w:r>
+        <w:rPr>
+          <w:rFonts w:ascii="Consolas" w:eastAsia="Consolas" w:hAnsi="Consolas" w:cs="Consolas"/>
+          <w:color w:val="F8F8F2"/>
+          <w:sz w:val="23"/>
+          <w:szCs w:val="23"/>
+          <w:shd w:val="clear" w:color="auto" w:fill="272822"/>
+        </w:rPr>
+        <w:t>, ]</w:t>
+      </w:r>
+      <w:proofErr w:type="gramEnd"/>
+      <w:r>
+        <w:rPr>
+          <w:rFonts w:ascii="Consolas" w:eastAsia="Consolas" w:hAnsi="Consolas" w:cs="Consolas"/>
+          <w:color w:val="F8F8F2"/>
+          <w:sz w:val="23"/>
+          <w:szCs w:val="23"/>
+          <w:shd w:val="clear" w:color="auto" w:fill="272822"/>
+        </w:rPr>
+        <w:t xml:space="preserve">   |</w:t>
       </w:r>
       <w:r>
         <w:rPr>
@@ -3898,6 +5953,7 @@
         </w:rPr>
         <w:t>|M     |</w:t>
       </w:r>
+      <w:proofErr w:type="gramStart"/>
       <w:r>
         <w:rPr>
           <w:rFonts w:ascii="Consolas" w:eastAsia="Consolas" w:hAnsi="Consolas" w:cs="Consolas"/>
@@ -3918,6 +5974,7 @@
         </w:rPr>
         <w:t xml:space="preserve">  |</w:t>
       </w:r>
+      <w:proofErr w:type="gramEnd"/>
     </w:p>
     <w:p>
       <w:pPr>
@@ -3931,16 +5988,62 @@
           <w:shd w:val="clear" w:color="auto" w:fill="272822"/>
         </w:rPr>
       </w:pPr>
-      <w:r>
-        <w:rPr>
-          <w:rFonts w:ascii="Consolas" w:eastAsia="Consolas" w:hAnsi="Consolas" w:cs="Consolas"/>
-          <w:color w:val="F8F8F2"/>
-          <w:sz w:val="23"/>
-          <w:szCs w:val="23"/>
-          <w:shd w:val="clear" w:color="auto" w:fill="272822"/>
-        </w:rPr>
-        <w:t>|[Robert, , Williams]|</w:t>
-      </w:r>
+      <w:proofErr w:type="gramStart"/>
+      <w:r>
+        <w:rPr>
+          <w:rFonts w:ascii="Consolas" w:eastAsia="Consolas" w:hAnsi="Consolas" w:cs="Consolas"/>
+          <w:color w:val="F8F8F2"/>
+          <w:sz w:val="23"/>
+          <w:szCs w:val="23"/>
+          <w:shd w:val="clear" w:color="auto" w:fill="272822"/>
+        </w:rPr>
+        <w:t>|[</w:t>
+      </w:r>
+      <w:proofErr w:type="gramEnd"/>
+      <w:r>
+        <w:rPr>
+          <w:rFonts w:ascii="Consolas" w:eastAsia="Consolas" w:hAnsi="Consolas" w:cs="Consolas"/>
+          <w:color w:val="F8F8F2"/>
+          <w:sz w:val="23"/>
+          <w:szCs w:val="23"/>
+          <w:shd w:val="clear" w:color="auto" w:fill="272822"/>
+        </w:rPr>
+        <w:t>Robert</w:t>
+      </w:r>
+      <w:proofErr w:type="gramStart"/>
+      <w:r>
+        <w:rPr>
+          <w:rFonts w:ascii="Consolas" w:eastAsia="Consolas" w:hAnsi="Consolas" w:cs="Consolas"/>
+          <w:color w:val="F8F8F2"/>
+          <w:sz w:val="23"/>
+          <w:szCs w:val="23"/>
+          <w:shd w:val="clear" w:color="auto" w:fill="272822"/>
+        </w:rPr>
+        <w:t>, ,</w:t>
+      </w:r>
+      <w:proofErr w:type="gramEnd"/>
+      <w:r>
+        <w:rPr>
+          <w:rFonts w:ascii="Consolas" w:eastAsia="Consolas" w:hAnsi="Consolas" w:cs="Consolas"/>
+          <w:color w:val="F8F8F2"/>
+          <w:sz w:val="23"/>
+          <w:szCs w:val="23"/>
+          <w:shd w:val="clear" w:color="auto" w:fill="272822"/>
+        </w:rPr>
+        <w:t xml:space="preserve"> </w:t>
+      </w:r>
+      <w:proofErr w:type="gramStart"/>
+      <w:r>
+        <w:rPr>
+          <w:rFonts w:ascii="Consolas" w:eastAsia="Consolas" w:hAnsi="Consolas" w:cs="Consolas"/>
+          <w:color w:val="F8F8F2"/>
+          <w:sz w:val="23"/>
+          <w:szCs w:val="23"/>
+          <w:shd w:val="clear" w:color="auto" w:fill="272822"/>
+        </w:rPr>
+        <w:t>Williams]|</w:t>
+      </w:r>
+      <w:proofErr w:type="gramEnd"/>
       <w:r>
         <w:rPr>
           <w:rFonts w:ascii="Consolas" w:eastAsia="Consolas" w:hAnsi="Consolas" w:cs="Consolas"/>
@@ -3961,6 +6064,7 @@
         </w:rPr>
         <w:t>|M     |</w:t>
       </w:r>
+      <w:proofErr w:type="gramStart"/>
       <w:r>
         <w:rPr>
           <w:rFonts w:ascii="Consolas" w:eastAsia="Consolas" w:hAnsi="Consolas" w:cs="Consolas"/>
@@ -3981,6 +6085,7 @@
         </w:rPr>
         <w:t xml:space="preserve">  |</w:t>
       </w:r>
+      <w:proofErr w:type="gramEnd"/>
     </w:p>
     <w:p>
       <w:pPr>
@@ -3994,16 +6099,40 @@
           <w:shd w:val="clear" w:color="auto" w:fill="272822"/>
         </w:rPr>
       </w:pPr>
-      <w:r>
-        <w:rPr>
-          <w:rFonts w:ascii="Consolas" w:eastAsia="Consolas" w:hAnsi="Consolas" w:cs="Consolas"/>
-          <w:color w:val="F8F8F2"/>
-          <w:sz w:val="23"/>
-          <w:szCs w:val="23"/>
-          <w:shd w:val="clear" w:color="auto" w:fill="272822"/>
-        </w:rPr>
-        <w:t>|[Maria, Anne, Jones]|</w:t>
-      </w:r>
+      <w:proofErr w:type="gramStart"/>
+      <w:r>
+        <w:rPr>
+          <w:rFonts w:ascii="Consolas" w:eastAsia="Consolas" w:hAnsi="Consolas" w:cs="Consolas"/>
+          <w:color w:val="F8F8F2"/>
+          <w:sz w:val="23"/>
+          <w:szCs w:val="23"/>
+          <w:shd w:val="clear" w:color="auto" w:fill="272822"/>
+        </w:rPr>
+        <w:t>|[</w:t>
+      </w:r>
+      <w:proofErr w:type="gramEnd"/>
+      <w:r>
+        <w:rPr>
+          <w:rFonts w:ascii="Consolas" w:eastAsia="Consolas" w:hAnsi="Consolas" w:cs="Consolas"/>
+          <w:color w:val="F8F8F2"/>
+          <w:sz w:val="23"/>
+          <w:szCs w:val="23"/>
+          <w:shd w:val="clear" w:color="auto" w:fill="272822"/>
+        </w:rPr>
+        <w:t xml:space="preserve">Maria, Anne, </w:t>
+      </w:r>
+      <w:proofErr w:type="gramStart"/>
+      <w:r>
+        <w:rPr>
+          <w:rFonts w:ascii="Consolas" w:eastAsia="Consolas" w:hAnsi="Consolas" w:cs="Consolas"/>
+          <w:color w:val="F8F8F2"/>
+          <w:sz w:val="23"/>
+          <w:szCs w:val="23"/>
+          <w:shd w:val="clear" w:color="auto" w:fill="272822"/>
+        </w:rPr>
+        <w:t>Jones]|</w:t>
+      </w:r>
+      <w:proofErr w:type="gramEnd"/>
       <w:r>
         <w:rPr>
           <w:rFonts w:ascii="Consolas" w:eastAsia="Consolas" w:hAnsi="Consolas" w:cs="Consolas"/>
@@ -4024,6 +6153,7 @@
         </w:rPr>
         <w:t>|F     |</w:t>
       </w:r>
+      <w:proofErr w:type="gramStart"/>
       <w:r>
         <w:rPr>
           <w:rFonts w:ascii="Consolas" w:eastAsia="Consolas" w:hAnsi="Consolas" w:cs="Consolas"/>
@@ -4044,6 +6174,7 @@
         </w:rPr>
         <w:t xml:space="preserve">  |</w:t>
       </w:r>
+      <w:proofErr w:type="gramEnd"/>
     </w:p>
     <w:p>
       <w:pPr>
@@ -4057,15 +6188,49 @@
           <w:shd w:val="clear" w:color="auto" w:fill="272822"/>
         </w:rPr>
       </w:pPr>
-      <w:r>
-        <w:rPr>
-          <w:rFonts w:ascii="Consolas" w:eastAsia="Consolas" w:hAnsi="Consolas" w:cs="Consolas"/>
-          <w:color w:val="F8F8F2"/>
-          <w:sz w:val="23"/>
-          <w:szCs w:val="23"/>
-          <w:shd w:val="clear" w:color="auto" w:fill="272822"/>
-        </w:rPr>
-        <w:t>|[Jen, Mary, Brown]  |     |F     |-</w:t>
+      <w:proofErr w:type="gramStart"/>
+      <w:r>
+        <w:rPr>
+          <w:rFonts w:ascii="Consolas" w:eastAsia="Consolas" w:hAnsi="Consolas" w:cs="Consolas"/>
+          <w:color w:val="F8F8F2"/>
+          <w:sz w:val="23"/>
+          <w:szCs w:val="23"/>
+          <w:shd w:val="clear" w:color="auto" w:fill="272822"/>
+        </w:rPr>
+        <w:t>|[</w:t>
+      </w:r>
+      <w:proofErr w:type="gramEnd"/>
+      <w:r>
+        <w:rPr>
+          <w:rFonts w:ascii="Consolas" w:eastAsia="Consolas" w:hAnsi="Consolas" w:cs="Consolas"/>
+          <w:color w:val="F8F8F2"/>
+          <w:sz w:val="23"/>
+          <w:szCs w:val="23"/>
+          <w:shd w:val="clear" w:color="auto" w:fill="272822"/>
+        </w:rPr>
+        <w:t xml:space="preserve">Jen, Mary, </w:t>
+      </w:r>
+      <w:proofErr w:type="gramStart"/>
+      <w:r>
+        <w:rPr>
+          <w:rFonts w:ascii="Consolas" w:eastAsia="Consolas" w:hAnsi="Consolas" w:cs="Consolas"/>
+          <w:color w:val="F8F8F2"/>
+          <w:sz w:val="23"/>
+          <w:szCs w:val="23"/>
+          <w:shd w:val="clear" w:color="auto" w:fill="272822"/>
+        </w:rPr>
+        <w:t>Brown]  |</w:t>
+      </w:r>
+      <w:proofErr w:type="gramEnd"/>
+      <w:r>
+        <w:rPr>
+          <w:rFonts w:ascii="Consolas" w:eastAsia="Consolas" w:hAnsi="Consolas" w:cs="Consolas"/>
+          <w:color w:val="F8F8F2"/>
+          <w:sz w:val="23"/>
+          <w:szCs w:val="23"/>
+          <w:shd w:val="clear" w:color="auto" w:fill="272822"/>
+        </w:rPr>
+        <w:t xml:space="preserve">     |F     |-</w:t>
       </w:r>
       <w:r>
         <w:rPr>
@@ -4170,7 +6335,41 @@
           <w:szCs w:val="33"/>
           <w:shd w:val="clear" w:color="auto" w:fill="F9F9F9"/>
         </w:rPr>
-        <w:t>Using createDataFrame()</w:t>
+        <w:t xml:space="preserve">Using </w:t>
+      </w:r>
+      <w:proofErr w:type="spellStart"/>
+      <w:proofErr w:type="gramStart"/>
+      <w:r>
+        <w:rPr>
+          <w:b/>
+          <w:color w:val="1E73BE"/>
+          <w:sz w:val="33"/>
+          <w:szCs w:val="33"/>
+          <w:shd w:val="clear" w:color="auto" w:fill="F9F9F9"/>
+        </w:rPr>
+        <w:t>createDataFrame</w:t>
+      </w:r>
+      <w:proofErr w:type="spellEnd"/>
+      <w:r>
+        <w:rPr>
+          <w:b/>
+          <w:color w:val="1E73BE"/>
+          <w:sz w:val="33"/>
+          <w:szCs w:val="33"/>
+          <w:shd w:val="clear" w:color="auto" w:fill="F9F9F9"/>
+        </w:rPr>
+        <w:t>(</w:t>
+      </w:r>
+      <w:proofErr w:type="gramEnd"/>
+      <w:r>
+        <w:rPr>
+          <w:b/>
+          <w:color w:val="1E73BE"/>
+          <w:sz w:val="33"/>
+          <w:szCs w:val="33"/>
+          <w:shd w:val="clear" w:color="auto" w:fill="F9F9F9"/>
+        </w:rPr>
+        <w:t>)</w:t>
       </w:r>
     </w:p>
     <w:p>
@@ -4189,7 +6388,99 @@
           <w:szCs w:val="23"/>
           <w:shd w:val="clear" w:color="auto" w:fill="F9F9F9"/>
         </w:rPr>
-        <w:t>Using createDataFrame() from SparkSession is another way to create manually and it takes rdd object as an argument. and chain with toDF() to specify name to the columns.</w:t>
+        <w:t xml:space="preserve">Using </w:t>
+      </w:r>
+      <w:proofErr w:type="spellStart"/>
+      <w:proofErr w:type="gramStart"/>
+      <w:r>
+        <w:rPr>
+          <w:sz w:val="23"/>
+          <w:szCs w:val="23"/>
+          <w:shd w:val="clear" w:color="auto" w:fill="F9F9F9"/>
+        </w:rPr>
+        <w:t>createDataFrame</w:t>
+      </w:r>
+      <w:proofErr w:type="spellEnd"/>
+      <w:r>
+        <w:rPr>
+          <w:sz w:val="23"/>
+          <w:szCs w:val="23"/>
+          <w:shd w:val="clear" w:color="auto" w:fill="F9F9F9"/>
+        </w:rPr>
+        <w:t>(</w:t>
+      </w:r>
+      <w:proofErr w:type="gramEnd"/>
+      <w:r>
+        <w:rPr>
+          <w:sz w:val="23"/>
+          <w:szCs w:val="23"/>
+          <w:shd w:val="clear" w:color="auto" w:fill="F9F9F9"/>
+        </w:rPr>
+        <w:t xml:space="preserve">) from </w:t>
+      </w:r>
+      <w:proofErr w:type="spellStart"/>
+      <w:r>
+        <w:rPr>
+          <w:sz w:val="23"/>
+          <w:szCs w:val="23"/>
+          <w:shd w:val="clear" w:color="auto" w:fill="F9F9F9"/>
+        </w:rPr>
+        <w:t>SparkSession</w:t>
+      </w:r>
+      <w:proofErr w:type="spellEnd"/>
+      <w:r>
+        <w:rPr>
+          <w:sz w:val="23"/>
+          <w:szCs w:val="23"/>
+          <w:shd w:val="clear" w:color="auto" w:fill="F9F9F9"/>
+        </w:rPr>
+        <w:t xml:space="preserve"> is another way to create manually and it takes </w:t>
+      </w:r>
+      <w:proofErr w:type="spellStart"/>
+      <w:r>
+        <w:rPr>
+          <w:sz w:val="23"/>
+          <w:szCs w:val="23"/>
+          <w:shd w:val="clear" w:color="auto" w:fill="F9F9F9"/>
+        </w:rPr>
+        <w:t>rdd</w:t>
+      </w:r>
+      <w:proofErr w:type="spellEnd"/>
+      <w:r>
+        <w:rPr>
+          <w:sz w:val="23"/>
+          <w:szCs w:val="23"/>
+          <w:shd w:val="clear" w:color="auto" w:fill="F9F9F9"/>
+        </w:rPr>
+        <w:t xml:space="preserve"> object as an argument. and chain with </w:t>
+      </w:r>
+      <w:proofErr w:type="spellStart"/>
+      <w:proofErr w:type="gramStart"/>
+      <w:r>
+        <w:rPr>
+          <w:sz w:val="23"/>
+          <w:szCs w:val="23"/>
+          <w:shd w:val="clear" w:color="auto" w:fill="F9F9F9"/>
+        </w:rPr>
+        <w:t>toDF</w:t>
+      </w:r>
+      <w:proofErr w:type="spellEnd"/>
+      <w:r>
+        <w:rPr>
+          <w:sz w:val="23"/>
+          <w:szCs w:val="23"/>
+          <w:shd w:val="clear" w:color="auto" w:fill="F9F9F9"/>
+        </w:rPr>
+        <w:t>(</w:t>
+      </w:r>
+      <w:proofErr w:type="gramEnd"/>
+      <w:r>
+        <w:rPr>
+          <w:sz w:val="23"/>
+          <w:szCs w:val="23"/>
+          <w:shd w:val="clear" w:color="auto" w:fill="F9F9F9"/>
+        </w:rPr>
+        <w:t>) to specify name to the columns.</w:t>
       </w:r>
     </w:p>
     <w:p>
@@ -4283,7 +6574,65 @@
                 <w:szCs w:val="23"/>
                 <w:shd w:val="clear" w:color="auto" w:fill="F9F9F9"/>
               </w:rPr>
-              <w:t>dfFromRDD2 = spark.createDataFrame(rdd).toDF(*columns)</w:t>
+              <w:t xml:space="preserve">dfFromRDD2 = </w:t>
+            </w:r>
+            <w:proofErr w:type="spellStart"/>
+            <w:proofErr w:type="gramStart"/>
+            <w:r>
+              <w:rPr>
+                <w:sz w:val="23"/>
+                <w:szCs w:val="23"/>
+                <w:shd w:val="clear" w:color="auto" w:fill="F9F9F9"/>
+              </w:rPr>
+              <w:t>spark.createDataFrame</w:t>
+            </w:r>
+            <w:proofErr w:type="spellEnd"/>
+            <w:proofErr w:type="gramEnd"/>
+            <w:r>
+              <w:rPr>
+                <w:sz w:val="23"/>
+                <w:szCs w:val="23"/>
+                <w:shd w:val="clear" w:color="auto" w:fill="F9F9F9"/>
+              </w:rPr>
+              <w:t>(</w:t>
+            </w:r>
+            <w:proofErr w:type="spellStart"/>
+            <w:r>
+              <w:rPr>
+                <w:sz w:val="23"/>
+                <w:szCs w:val="23"/>
+                <w:shd w:val="clear" w:color="auto" w:fill="F9F9F9"/>
+              </w:rPr>
+              <w:t>rdd</w:t>
+            </w:r>
+            <w:proofErr w:type="spellEnd"/>
+            <w:proofErr w:type="gramStart"/>
+            <w:r>
+              <w:rPr>
+                <w:sz w:val="23"/>
+                <w:szCs w:val="23"/>
+                <w:shd w:val="clear" w:color="auto" w:fill="F9F9F9"/>
+              </w:rPr>
+              <w:t>).</w:t>
+            </w:r>
+            <w:proofErr w:type="spellStart"/>
+            <w:r>
+              <w:rPr>
+                <w:sz w:val="23"/>
+                <w:szCs w:val="23"/>
+                <w:shd w:val="clear" w:color="auto" w:fill="F9F9F9"/>
+              </w:rPr>
+              <w:t>toDF</w:t>
+            </w:r>
+            <w:proofErr w:type="spellEnd"/>
+            <w:proofErr w:type="gramEnd"/>
+            <w:r>
+              <w:rPr>
+                <w:sz w:val="23"/>
+                <w:szCs w:val="23"/>
+                <w:shd w:val="clear" w:color="auto" w:fill="F9F9F9"/>
+              </w:rPr>
+              <w:t>(*columns)</w:t>
             </w:r>
           </w:p>
           <w:p>
@@ -4352,8 +6701,54 @@
           <w:szCs w:val="33"/>
           <w:shd w:val="clear" w:color="auto" w:fill="F9F9F9"/>
         </w:rPr>
-        <w:t>Using createDataFrame() from SparkSession</w:t>
-      </w:r>
+        <w:t xml:space="preserve">Using </w:t>
+      </w:r>
+      <w:proofErr w:type="spellStart"/>
+      <w:proofErr w:type="gramStart"/>
+      <w:r>
+        <w:rPr>
+          <w:b/>
+          <w:color w:val="1E73BE"/>
+          <w:sz w:val="33"/>
+          <w:szCs w:val="33"/>
+          <w:shd w:val="clear" w:color="auto" w:fill="F9F9F9"/>
+        </w:rPr>
+        <w:t>createDataFrame</w:t>
+      </w:r>
+      <w:proofErr w:type="spellEnd"/>
+      <w:r>
+        <w:rPr>
+          <w:b/>
+          <w:color w:val="1E73BE"/>
+          <w:sz w:val="33"/>
+          <w:szCs w:val="33"/>
+          <w:shd w:val="clear" w:color="auto" w:fill="F9F9F9"/>
+        </w:rPr>
+        <w:t>(</w:t>
+      </w:r>
+      <w:proofErr w:type="gramEnd"/>
+      <w:r>
+        <w:rPr>
+          <w:b/>
+          <w:color w:val="1E73BE"/>
+          <w:sz w:val="33"/>
+          <w:szCs w:val="33"/>
+          <w:shd w:val="clear" w:color="auto" w:fill="F9F9F9"/>
+        </w:rPr>
+        <w:t xml:space="preserve">) from </w:t>
+      </w:r>
+      <w:proofErr w:type="spellStart"/>
+      <w:r>
+        <w:rPr>
+          <w:b/>
+          <w:color w:val="1E73BE"/>
+          <w:sz w:val="33"/>
+          <w:szCs w:val="33"/>
+          <w:shd w:val="clear" w:color="auto" w:fill="F9F9F9"/>
+        </w:rPr>
+        <w:t>SparkSession</w:t>
+      </w:r>
+      <w:proofErr w:type="spellEnd"/>
     </w:p>
     <w:p>
       <w:pPr>
@@ -4375,6 +6770,8 @@
         <w:lastRenderedPageBreak/>
         <w:t xml:space="preserve">Calling </w:t>
       </w:r>
+      <w:proofErr w:type="spellStart"/>
+      <w:proofErr w:type="gramStart"/>
       <w:r>
         <w:rPr>
           <w:rFonts w:ascii="Courier New" w:eastAsia="Courier New" w:hAnsi="Courier New" w:cs="Courier New"/>
@@ -4382,7 +6779,27 @@
           <w:szCs w:val="24"/>
           <w:shd w:val="clear" w:color="auto" w:fill="E3E3E4"/>
         </w:rPr>
-        <w:t>createDataFrame()</w:t>
+        <w:t>createDataFrame</w:t>
+      </w:r>
+      <w:proofErr w:type="spellEnd"/>
+      <w:r>
+        <w:rPr>
+          <w:rFonts w:ascii="Courier New" w:eastAsia="Courier New" w:hAnsi="Courier New" w:cs="Courier New"/>
+          <w:sz w:val="24"/>
+          <w:szCs w:val="24"/>
+          <w:shd w:val="clear" w:color="auto" w:fill="E3E3E4"/>
+        </w:rPr>
+        <w:t>(</w:t>
+      </w:r>
+      <w:proofErr w:type="gramEnd"/>
+      <w:r>
+        <w:rPr>
+          <w:rFonts w:ascii="Courier New" w:eastAsia="Courier New" w:hAnsi="Courier New" w:cs="Courier New"/>
+          <w:sz w:val="24"/>
+          <w:szCs w:val="24"/>
+          <w:shd w:val="clear" w:color="auto" w:fill="E3E3E4"/>
+        </w:rPr>
+        <w:t>)</w:t>
       </w:r>
       <w:r>
         <w:rPr>
@@ -4392,6 +6809,7 @@
         </w:rPr>
         <w:t xml:space="preserve"> from </w:t>
       </w:r>
+      <w:proofErr w:type="spellStart"/>
       <w:r>
         <w:rPr>
           <w:rFonts w:ascii="Courier New" w:eastAsia="Courier New" w:hAnsi="Courier New" w:cs="Courier New"/>
@@ -4399,16 +6817,9 @@
           <w:szCs w:val="24"/>
           <w:shd w:val="clear" w:color="auto" w:fill="E3E3E4"/>
         </w:rPr>
-        <w:t xml:space="preserve">SparkSession </w:t>
-      </w:r>
-      <w:r>
-        <w:rPr>
-          <w:sz w:val="23"/>
-          <w:szCs w:val="23"/>
-          <w:shd w:val="clear" w:color="auto" w:fill="F9F9F9"/>
-        </w:rPr>
-        <w:t xml:space="preserve">is another way to create PySpark DataFrame manually, it takes a list object as an argument. and chain with </w:t>
-      </w:r>
+        <w:t>SparkSession</w:t>
+      </w:r>
+      <w:proofErr w:type="spellEnd"/>
       <w:r>
         <w:rPr>
           <w:rFonts w:ascii="Courier New" w:eastAsia="Courier New" w:hAnsi="Courier New" w:cs="Courier New"/>
@@ -4416,7 +6827,82 @@
           <w:szCs w:val="24"/>
           <w:shd w:val="clear" w:color="auto" w:fill="E3E3E4"/>
         </w:rPr>
-        <w:t>toDF()</w:t>
+        <w:t xml:space="preserve"> </w:t>
+      </w:r>
+      <w:r>
+        <w:rPr>
+          <w:sz w:val="23"/>
+          <w:szCs w:val="23"/>
+          <w:shd w:val="clear" w:color="auto" w:fill="F9F9F9"/>
+        </w:rPr>
+        <w:t xml:space="preserve">is another way to create </w:t>
+      </w:r>
+      <w:proofErr w:type="spellStart"/>
+      <w:r>
+        <w:rPr>
+          <w:sz w:val="23"/>
+          <w:szCs w:val="23"/>
+          <w:shd w:val="clear" w:color="auto" w:fill="F9F9F9"/>
+        </w:rPr>
+        <w:t>PySpark</w:t>
+      </w:r>
+      <w:proofErr w:type="spellEnd"/>
+      <w:r>
+        <w:rPr>
+          <w:sz w:val="23"/>
+          <w:szCs w:val="23"/>
+          <w:shd w:val="clear" w:color="auto" w:fill="F9F9F9"/>
+        </w:rPr>
+        <w:t xml:space="preserve"> </w:t>
+      </w:r>
+      <w:proofErr w:type="spellStart"/>
+      <w:r>
+        <w:rPr>
+          <w:sz w:val="23"/>
+          <w:szCs w:val="23"/>
+          <w:shd w:val="clear" w:color="auto" w:fill="F9F9F9"/>
+        </w:rPr>
+        <w:t>DataFrame</w:t>
+      </w:r>
+      <w:proofErr w:type="spellEnd"/>
+      <w:r>
+        <w:rPr>
+          <w:sz w:val="23"/>
+          <w:szCs w:val="23"/>
+          <w:shd w:val="clear" w:color="auto" w:fill="F9F9F9"/>
+        </w:rPr>
+        <w:t xml:space="preserve"> manually, it takes a list object as an argument. and chain with </w:t>
+      </w:r>
+      <w:proofErr w:type="spellStart"/>
+      <w:proofErr w:type="gramStart"/>
+      <w:r>
+        <w:rPr>
+          <w:rFonts w:ascii="Courier New" w:eastAsia="Courier New" w:hAnsi="Courier New" w:cs="Courier New"/>
+          <w:sz w:val="24"/>
+          <w:szCs w:val="24"/>
+          <w:shd w:val="clear" w:color="auto" w:fill="E3E3E4"/>
+        </w:rPr>
+        <w:t>toDF</w:t>
+      </w:r>
+      <w:proofErr w:type="spellEnd"/>
+      <w:r>
+        <w:rPr>
+          <w:rFonts w:ascii="Courier New" w:eastAsia="Courier New" w:hAnsi="Courier New" w:cs="Courier New"/>
+          <w:sz w:val="24"/>
+          <w:szCs w:val="24"/>
+          <w:shd w:val="clear" w:color="auto" w:fill="E3E3E4"/>
+        </w:rPr>
+        <w:t>(</w:t>
+      </w:r>
+      <w:proofErr w:type="gramEnd"/>
+      <w:r>
+        <w:rPr>
+          <w:rFonts w:ascii="Courier New" w:eastAsia="Courier New" w:hAnsi="Courier New" w:cs="Courier New"/>
+          <w:sz w:val="24"/>
+          <w:szCs w:val="24"/>
+          <w:shd w:val="clear" w:color="auto" w:fill="E3E3E4"/>
+        </w:rPr>
+        <w:t>)</w:t>
       </w:r>
       <w:r>
         <w:rPr>
@@ -4507,7 +6993,55 @@
                 <w:szCs w:val="23"/>
                 <w:shd w:val="clear" w:color="auto" w:fill="F9F9F9"/>
               </w:rPr>
-              <w:t>dfFromData2 = spark.createDataFrame(data).toDF(*columns)</w:t>
+              <w:t xml:space="preserve">dfFromData2 = </w:t>
+            </w:r>
+            <w:proofErr w:type="spellStart"/>
+            <w:proofErr w:type="gramStart"/>
+            <w:r>
+              <w:rPr>
+                <w:sz w:val="23"/>
+                <w:szCs w:val="23"/>
+                <w:shd w:val="clear" w:color="auto" w:fill="F9F9F9"/>
+              </w:rPr>
+              <w:t>spark.createDataFrame</w:t>
+            </w:r>
+            <w:proofErr w:type="spellEnd"/>
+            <w:proofErr w:type="gramEnd"/>
+            <w:r>
+              <w:rPr>
+                <w:sz w:val="23"/>
+                <w:szCs w:val="23"/>
+                <w:shd w:val="clear" w:color="auto" w:fill="F9F9F9"/>
+              </w:rPr>
+              <w:t>(data</w:t>
+            </w:r>
+            <w:proofErr w:type="gramStart"/>
+            <w:r>
+              <w:rPr>
+                <w:sz w:val="23"/>
+                <w:szCs w:val="23"/>
+                <w:shd w:val="clear" w:color="auto" w:fill="F9F9F9"/>
+              </w:rPr>
+              <w:t>).</w:t>
+            </w:r>
+            <w:proofErr w:type="spellStart"/>
+            <w:r>
+              <w:rPr>
+                <w:sz w:val="23"/>
+                <w:szCs w:val="23"/>
+                <w:shd w:val="clear" w:color="auto" w:fill="F9F9F9"/>
+              </w:rPr>
+              <w:t>toDF</w:t>
+            </w:r>
+            <w:proofErr w:type="spellEnd"/>
+            <w:proofErr w:type="gramEnd"/>
+            <w:r>
+              <w:rPr>
+                <w:sz w:val="23"/>
+                <w:szCs w:val="23"/>
+                <w:shd w:val="clear" w:color="auto" w:fill="F9F9F9"/>
+              </w:rPr>
+              <w:t>(*columns)</w:t>
             </w:r>
           </w:p>
           <w:p>
@@ -4559,6 +7093,734 @@
           <w:shd w:val="clear" w:color="auto" w:fill="F9F9F9"/>
         </w:rPr>
       </w:pPr>
+    </w:p>
+    <w:p>
+      <w:pPr>
+        <w:spacing w:after="20" w:line="240" w:lineRule="auto"/>
+        <w:jc w:val="both"/>
+        <w:rPr>
+          <w:sz w:val="24"/>
+          <w:szCs w:val="24"/>
+          <w:shd w:val="clear" w:color="auto" w:fill="F9F9F9"/>
+        </w:rPr>
+      </w:pPr>
+    </w:p>
+    <w:p>
+      <w:pPr>
+        <w:spacing w:after="20" w:line="240" w:lineRule="auto"/>
+        <w:jc w:val="both"/>
+        <w:rPr>
+          <w:b/>
+          <w:bCs/>
+          <w:sz w:val="24"/>
+          <w:szCs w:val="24"/>
+          <w:shd w:val="clear" w:color="auto" w:fill="F9F9F9"/>
+          <w:lang w:val="en-US"/>
+        </w:rPr>
+      </w:pPr>
+      <w:r>
+        <w:rPr>
+          <w:b/>
+          <w:bCs/>
+          <w:sz w:val="24"/>
+          <w:szCs w:val="24"/>
+          <w:shd w:val="clear" w:color="auto" w:fill="F9F9F9"/>
+          <w:lang w:val="en-US"/>
+        </w:rPr>
+        <w:t xml:space="preserve">Overall </w:t>
+      </w:r>
+      <w:proofErr w:type="gramStart"/>
+      <w:r>
+        <w:rPr>
+          <w:b/>
+          <w:bCs/>
+          <w:sz w:val="24"/>
+          <w:szCs w:val="24"/>
+          <w:shd w:val="clear" w:color="auto" w:fill="F9F9F9"/>
+          <w:lang w:val="en-US"/>
+        </w:rPr>
+        <w:t>Summary</w:t>
+      </w:r>
+      <w:r>
+        <w:rPr>
+          <w:b/>
+          <w:bCs/>
+          <w:sz w:val="24"/>
+          <w:szCs w:val="24"/>
+          <w:shd w:val="clear" w:color="auto" w:fill="F9F9F9"/>
+          <w:lang w:val="en-US"/>
+        </w:rPr>
+        <w:t xml:space="preserve"> </w:t>
+      </w:r>
+      <w:r>
+        <w:rPr>
+          <w:b/>
+          <w:bCs/>
+          <w:sz w:val="24"/>
+          <w:szCs w:val="24"/>
+          <w:shd w:val="clear" w:color="auto" w:fill="F9F9F9"/>
+          <w:lang w:val="en-US"/>
+        </w:rPr>
+        <w:t>:</w:t>
+      </w:r>
+      <w:proofErr w:type="gramEnd"/>
+      <w:r>
+        <w:rPr>
+          <w:b/>
+          <w:bCs/>
+          <w:sz w:val="24"/>
+          <w:szCs w:val="24"/>
+          <w:shd w:val="clear" w:color="auto" w:fill="F9F9F9"/>
+          <w:lang w:val="en-US"/>
+        </w:rPr>
+        <w:t xml:space="preserve"> Creating </w:t>
+      </w:r>
+      <w:proofErr w:type="spellStart"/>
+      <w:r>
+        <w:rPr>
+          <w:b/>
+          <w:bCs/>
+          <w:sz w:val="24"/>
+          <w:szCs w:val="24"/>
+          <w:shd w:val="clear" w:color="auto" w:fill="F9F9F9"/>
+          <w:lang w:val="en-US"/>
+        </w:rPr>
+        <w:t>PySpark</w:t>
+      </w:r>
+      <w:proofErr w:type="spellEnd"/>
+      <w:r>
+        <w:rPr>
+          <w:b/>
+          <w:bCs/>
+          <w:sz w:val="24"/>
+          <w:szCs w:val="24"/>
+          <w:shd w:val="clear" w:color="auto" w:fill="F9F9F9"/>
+          <w:lang w:val="en-US"/>
+        </w:rPr>
+        <w:t xml:space="preserve"> </w:t>
+      </w:r>
+      <w:proofErr w:type="spellStart"/>
+      <w:r>
+        <w:rPr>
+          <w:b/>
+          <w:bCs/>
+          <w:sz w:val="24"/>
+          <w:szCs w:val="24"/>
+          <w:shd w:val="clear" w:color="auto" w:fill="F9F9F9"/>
+          <w:lang w:val="en-US"/>
+        </w:rPr>
+        <w:t>DataFrames</w:t>
+      </w:r>
+      <w:proofErr w:type="spellEnd"/>
+      <w:r>
+        <w:rPr>
+          <w:b/>
+          <w:bCs/>
+          <w:sz w:val="24"/>
+          <w:szCs w:val="24"/>
+          <w:shd w:val="clear" w:color="auto" w:fill="F9F9F9"/>
+          <w:lang w:val="en-US"/>
+        </w:rPr>
+        <w:t xml:space="preserve"> from RDDs and Defining Schemas</w:t>
+      </w:r>
+    </w:p>
+    <w:p>
+      <w:pPr>
+        <w:spacing w:after="20" w:line="240" w:lineRule="auto"/>
+        <w:jc w:val="both"/>
+        <w:rPr>
+          <w:b/>
+          <w:bCs/>
+          <w:sz w:val="24"/>
+          <w:szCs w:val="24"/>
+          <w:shd w:val="clear" w:color="auto" w:fill="F9F9F9"/>
+          <w:lang w:val="en-US"/>
+        </w:rPr>
+      </w:pPr>
+    </w:p>
+    <w:p>
+      <w:pPr>
+        <w:spacing w:after="20" w:line="240" w:lineRule="auto"/>
+        <w:jc w:val="both"/>
+        <w:rPr>
+          <w:sz w:val="24"/>
+          <w:szCs w:val="24"/>
+          <w:shd w:val="clear" w:color="auto" w:fill="F9F9F9"/>
+          <w:lang w:val="en-US"/>
+        </w:rPr>
+      </w:pPr>
+      <w:proofErr w:type="spellStart"/>
+      <w:r>
+        <w:rPr>
+          <w:sz w:val="24"/>
+          <w:szCs w:val="24"/>
+          <w:shd w:val="clear" w:color="auto" w:fill="F9F9F9"/>
+          <w:lang w:val="en-US"/>
+        </w:rPr>
+        <w:t>PySpark</w:t>
+      </w:r>
+      <w:proofErr w:type="spellEnd"/>
+      <w:r>
+        <w:rPr>
+          <w:sz w:val="24"/>
+          <w:szCs w:val="24"/>
+          <w:shd w:val="clear" w:color="auto" w:fill="F9F9F9"/>
+          <w:lang w:val="en-US"/>
+        </w:rPr>
+        <w:t xml:space="preserve"> provides multiple ways to create </w:t>
+      </w:r>
+      <w:proofErr w:type="spellStart"/>
+      <w:r>
+        <w:rPr>
+          <w:sz w:val="24"/>
+          <w:szCs w:val="24"/>
+          <w:shd w:val="clear" w:color="auto" w:fill="F9F9F9"/>
+          <w:lang w:val="en-US"/>
+        </w:rPr>
+        <w:t>DataFrames</w:t>
+      </w:r>
+      <w:proofErr w:type="spellEnd"/>
+      <w:r>
+        <w:rPr>
+          <w:sz w:val="24"/>
+          <w:szCs w:val="24"/>
+          <w:shd w:val="clear" w:color="auto" w:fill="F9F9F9"/>
+          <w:lang w:val="en-US"/>
+        </w:rPr>
+        <w:t xml:space="preserve"> from existing RDDs and Python collections using methods such as </w:t>
+      </w:r>
+      <w:proofErr w:type="spellStart"/>
+      <w:proofErr w:type="gramStart"/>
+      <w:r>
+        <w:rPr>
+          <w:sz w:val="24"/>
+          <w:szCs w:val="24"/>
+          <w:shd w:val="clear" w:color="auto" w:fill="F9F9F9"/>
+          <w:lang w:val="en-US"/>
+        </w:rPr>
+        <w:t>toDF</w:t>
+      </w:r>
+      <w:proofErr w:type="spellEnd"/>
+      <w:r>
+        <w:rPr>
+          <w:sz w:val="24"/>
+          <w:szCs w:val="24"/>
+          <w:shd w:val="clear" w:color="auto" w:fill="F9F9F9"/>
+          <w:lang w:val="en-US"/>
+        </w:rPr>
+        <w:t>(</w:t>
+      </w:r>
+      <w:proofErr w:type="gramEnd"/>
+      <w:r>
+        <w:rPr>
+          <w:sz w:val="24"/>
+          <w:szCs w:val="24"/>
+          <w:shd w:val="clear" w:color="auto" w:fill="F9F9F9"/>
+          <w:lang w:val="en-US"/>
+        </w:rPr>
+        <w:t xml:space="preserve">) and </w:t>
+      </w:r>
+      <w:proofErr w:type="spellStart"/>
+      <w:proofErr w:type="gramStart"/>
+      <w:r>
+        <w:rPr>
+          <w:sz w:val="24"/>
+          <w:szCs w:val="24"/>
+          <w:shd w:val="clear" w:color="auto" w:fill="F9F9F9"/>
+          <w:lang w:val="en-US"/>
+        </w:rPr>
+        <w:t>createDataFrame</w:t>
+      </w:r>
+      <w:proofErr w:type="spellEnd"/>
+      <w:r>
+        <w:rPr>
+          <w:sz w:val="24"/>
+          <w:szCs w:val="24"/>
+          <w:shd w:val="clear" w:color="auto" w:fill="F9F9F9"/>
+          <w:lang w:val="en-US"/>
+        </w:rPr>
+        <w:t>(</w:t>
+      </w:r>
+      <w:proofErr w:type="gramEnd"/>
+      <w:r>
+        <w:rPr>
+          <w:sz w:val="24"/>
+          <w:szCs w:val="24"/>
+          <w:shd w:val="clear" w:color="auto" w:fill="F9F9F9"/>
+          <w:lang w:val="en-US"/>
+        </w:rPr>
+        <w:t xml:space="preserve">). These methods allow us to convert structured data into </w:t>
+      </w:r>
+      <w:proofErr w:type="spellStart"/>
+      <w:r>
+        <w:rPr>
+          <w:sz w:val="24"/>
+          <w:szCs w:val="24"/>
+          <w:shd w:val="clear" w:color="auto" w:fill="F9F9F9"/>
+          <w:lang w:val="en-US"/>
+        </w:rPr>
+        <w:t>DataFrames</w:t>
+      </w:r>
+      <w:proofErr w:type="spellEnd"/>
+      <w:r>
+        <w:rPr>
+          <w:sz w:val="24"/>
+          <w:szCs w:val="24"/>
+          <w:shd w:val="clear" w:color="auto" w:fill="F9F9F9"/>
+          <w:lang w:val="en-US"/>
+        </w:rPr>
+        <w:t xml:space="preserve"> for easier data processing, analysis, and transformation.</w:t>
+      </w:r>
+    </w:p>
+    <w:p>
+      <w:pPr>
+        <w:spacing w:after="20" w:line="240" w:lineRule="auto"/>
+        <w:jc w:val="both"/>
+        <w:rPr>
+          <w:sz w:val="24"/>
+          <w:szCs w:val="24"/>
+          <w:shd w:val="clear" w:color="auto" w:fill="F9F9F9"/>
+          <w:lang w:val="en-US"/>
+        </w:rPr>
+      </w:pPr>
+      <w:r>
+        <w:rPr>
+          <w:sz w:val="24"/>
+          <w:szCs w:val="24"/>
+          <w:shd w:val="clear" w:color="auto" w:fill="F9F9F9"/>
+          <w:lang w:val="en-US"/>
+        </w:rPr>
+        <w:t xml:space="preserve">The </w:t>
+      </w:r>
+      <w:proofErr w:type="spellStart"/>
+      <w:proofErr w:type="gramStart"/>
+      <w:r>
+        <w:rPr>
+          <w:sz w:val="24"/>
+          <w:szCs w:val="24"/>
+          <w:shd w:val="clear" w:color="auto" w:fill="F9F9F9"/>
+          <w:lang w:val="en-US"/>
+        </w:rPr>
+        <w:t>toDF</w:t>
+      </w:r>
+      <w:proofErr w:type="spellEnd"/>
+      <w:r>
+        <w:rPr>
+          <w:sz w:val="24"/>
+          <w:szCs w:val="24"/>
+          <w:shd w:val="clear" w:color="auto" w:fill="F9F9F9"/>
+          <w:lang w:val="en-US"/>
+        </w:rPr>
+        <w:t>(</w:t>
+      </w:r>
+      <w:proofErr w:type="gramEnd"/>
+      <w:r>
+        <w:rPr>
+          <w:sz w:val="24"/>
+          <w:szCs w:val="24"/>
+          <w:shd w:val="clear" w:color="auto" w:fill="F9F9F9"/>
+          <w:lang w:val="en-US"/>
+        </w:rPr>
+        <w:t xml:space="preserve">) method can automatically assign default column names or accept custom column names. Similarly, </w:t>
+      </w:r>
+      <w:proofErr w:type="spellStart"/>
+      <w:proofErr w:type="gramStart"/>
+      <w:r>
+        <w:rPr>
+          <w:sz w:val="24"/>
+          <w:szCs w:val="24"/>
+          <w:shd w:val="clear" w:color="auto" w:fill="F9F9F9"/>
+          <w:lang w:val="en-US"/>
+        </w:rPr>
+        <w:t>spark.createDataFrame</w:t>
+      </w:r>
+      <w:proofErr w:type="spellEnd"/>
+      <w:proofErr w:type="gramEnd"/>
+      <w:r>
+        <w:rPr>
+          <w:sz w:val="24"/>
+          <w:szCs w:val="24"/>
+          <w:shd w:val="clear" w:color="auto" w:fill="F9F9F9"/>
+          <w:lang w:val="en-US"/>
+        </w:rPr>
+        <w:t xml:space="preserve">() allows us to create </w:t>
+      </w:r>
+      <w:proofErr w:type="spellStart"/>
+      <w:r>
+        <w:rPr>
+          <w:sz w:val="24"/>
+          <w:szCs w:val="24"/>
+          <w:shd w:val="clear" w:color="auto" w:fill="F9F9F9"/>
+          <w:lang w:val="en-US"/>
+        </w:rPr>
+        <w:t>DataFrames</w:t>
+      </w:r>
+      <w:proofErr w:type="spellEnd"/>
+      <w:r>
+        <w:rPr>
+          <w:sz w:val="24"/>
+          <w:szCs w:val="24"/>
+          <w:shd w:val="clear" w:color="auto" w:fill="F9F9F9"/>
+          <w:lang w:val="en-US"/>
+        </w:rPr>
+        <w:t xml:space="preserve"> directly from RDDs or Python lists and define column names using </w:t>
+      </w:r>
+      <w:proofErr w:type="spellStart"/>
+      <w:proofErr w:type="gramStart"/>
+      <w:r>
+        <w:rPr>
+          <w:sz w:val="24"/>
+          <w:szCs w:val="24"/>
+          <w:shd w:val="clear" w:color="auto" w:fill="F9F9F9"/>
+          <w:lang w:val="en-US"/>
+        </w:rPr>
+        <w:t>toDF</w:t>
+      </w:r>
+      <w:proofErr w:type="spellEnd"/>
+      <w:r>
+        <w:rPr>
+          <w:sz w:val="24"/>
+          <w:szCs w:val="24"/>
+          <w:shd w:val="clear" w:color="auto" w:fill="F9F9F9"/>
+          <w:lang w:val="en-US"/>
+        </w:rPr>
+        <w:t>(</w:t>
+      </w:r>
+      <w:proofErr w:type="gramEnd"/>
+      <w:r>
+        <w:rPr>
+          <w:sz w:val="24"/>
+          <w:szCs w:val="24"/>
+          <w:shd w:val="clear" w:color="auto" w:fill="F9F9F9"/>
+          <w:lang w:val="en-US"/>
+        </w:rPr>
+        <w:t>).</w:t>
+      </w:r>
+    </w:p>
+    <w:p>
+      <w:pPr>
+        <w:spacing w:after="20" w:line="240" w:lineRule="auto"/>
+        <w:jc w:val="both"/>
+        <w:rPr>
+          <w:sz w:val="24"/>
+          <w:szCs w:val="24"/>
+          <w:shd w:val="clear" w:color="auto" w:fill="F9F9F9"/>
+          <w:lang w:val="en-US"/>
+        </w:rPr>
+      </w:pPr>
+      <w:r>
+        <w:rPr>
+          <w:sz w:val="24"/>
+          <w:szCs w:val="24"/>
+          <w:shd w:val="clear" w:color="auto" w:fill="F9F9F9"/>
+          <w:lang w:val="en-US"/>
+        </w:rPr>
+        <w:t xml:space="preserve">StructType and </w:t>
+      </w:r>
+      <w:proofErr w:type="spellStart"/>
+      <w:r>
+        <w:rPr>
+          <w:sz w:val="24"/>
+          <w:szCs w:val="24"/>
+          <w:shd w:val="clear" w:color="auto" w:fill="F9F9F9"/>
+          <w:lang w:val="en-US"/>
+        </w:rPr>
+        <w:t>StructField</w:t>
+      </w:r>
+      <w:proofErr w:type="spellEnd"/>
+      <w:r>
+        <w:rPr>
+          <w:sz w:val="24"/>
+          <w:szCs w:val="24"/>
+          <w:shd w:val="clear" w:color="auto" w:fill="F9F9F9"/>
+          <w:lang w:val="en-US"/>
+        </w:rPr>
+        <w:t xml:space="preserve"> are used to define an explicit schema for a </w:t>
+      </w:r>
+      <w:proofErr w:type="spellStart"/>
+      <w:r>
+        <w:rPr>
+          <w:sz w:val="24"/>
+          <w:szCs w:val="24"/>
+          <w:shd w:val="clear" w:color="auto" w:fill="F9F9F9"/>
+          <w:lang w:val="en-US"/>
+        </w:rPr>
+        <w:t>DataFrame</w:t>
+      </w:r>
+      <w:proofErr w:type="spellEnd"/>
+      <w:r>
+        <w:rPr>
+          <w:sz w:val="24"/>
+          <w:szCs w:val="24"/>
+          <w:shd w:val="clear" w:color="auto" w:fill="F9F9F9"/>
+          <w:lang w:val="en-US"/>
+        </w:rPr>
+        <w:t xml:space="preserve">. StructType represents the overall structure of the </w:t>
+      </w:r>
+      <w:proofErr w:type="spellStart"/>
+      <w:r>
+        <w:rPr>
+          <w:sz w:val="24"/>
+          <w:szCs w:val="24"/>
+          <w:shd w:val="clear" w:color="auto" w:fill="F9F9F9"/>
+          <w:lang w:val="en-US"/>
+        </w:rPr>
+        <w:t>DataFrame</w:t>
+      </w:r>
+      <w:proofErr w:type="spellEnd"/>
+      <w:r>
+        <w:rPr>
+          <w:sz w:val="24"/>
+          <w:szCs w:val="24"/>
+          <w:shd w:val="clear" w:color="auto" w:fill="F9F9F9"/>
+          <w:lang w:val="en-US"/>
+        </w:rPr>
+        <w:t xml:space="preserve">, while </w:t>
+      </w:r>
+      <w:proofErr w:type="spellStart"/>
+      <w:r>
+        <w:rPr>
+          <w:sz w:val="24"/>
+          <w:szCs w:val="24"/>
+          <w:shd w:val="clear" w:color="auto" w:fill="F9F9F9"/>
+          <w:lang w:val="en-US"/>
+        </w:rPr>
+        <w:t>StructField</w:t>
+      </w:r>
+      <w:proofErr w:type="spellEnd"/>
+      <w:r>
+        <w:rPr>
+          <w:sz w:val="24"/>
+          <w:szCs w:val="24"/>
+          <w:shd w:val="clear" w:color="auto" w:fill="F9F9F9"/>
+          <w:lang w:val="en-US"/>
+        </w:rPr>
+        <w:t xml:space="preserve"> defines individual columns, including their names, data types, and nullability. Common data types include </w:t>
+      </w:r>
+      <w:proofErr w:type="spellStart"/>
+      <w:r>
+        <w:rPr>
+          <w:sz w:val="24"/>
+          <w:szCs w:val="24"/>
+          <w:shd w:val="clear" w:color="auto" w:fill="F9F9F9"/>
+          <w:lang w:val="en-US"/>
+        </w:rPr>
+        <w:t>StringType</w:t>
+      </w:r>
+      <w:proofErr w:type="spellEnd"/>
+      <w:r>
+        <w:rPr>
+          <w:sz w:val="24"/>
+          <w:szCs w:val="24"/>
+          <w:shd w:val="clear" w:color="auto" w:fill="F9F9F9"/>
+          <w:lang w:val="en-US"/>
+        </w:rPr>
+        <w:t xml:space="preserve">, </w:t>
+      </w:r>
+      <w:proofErr w:type="spellStart"/>
+      <w:r>
+        <w:rPr>
+          <w:sz w:val="24"/>
+          <w:szCs w:val="24"/>
+          <w:shd w:val="clear" w:color="auto" w:fill="F9F9F9"/>
+          <w:lang w:val="en-US"/>
+        </w:rPr>
+        <w:t>IntegerType</w:t>
+      </w:r>
+      <w:proofErr w:type="spellEnd"/>
+      <w:r>
+        <w:rPr>
+          <w:sz w:val="24"/>
+          <w:szCs w:val="24"/>
+          <w:shd w:val="clear" w:color="auto" w:fill="F9F9F9"/>
+          <w:lang w:val="en-US"/>
+        </w:rPr>
+        <w:t xml:space="preserve">, and </w:t>
+      </w:r>
+      <w:proofErr w:type="spellStart"/>
+      <w:r>
+        <w:rPr>
+          <w:sz w:val="24"/>
+          <w:szCs w:val="24"/>
+          <w:shd w:val="clear" w:color="auto" w:fill="F9F9F9"/>
+          <w:lang w:val="en-US"/>
+        </w:rPr>
+        <w:t>DoubleType</w:t>
+      </w:r>
+      <w:proofErr w:type="spellEnd"/>
+      <w:r>
+        <w:rPr>
+          <w:sz w:val="24"/>
+          <w:szCs w:val="24"/>
+          <w:shd w:val="clear" w:color="auto" w:fill="F9F9F9"/>
+          <w:lang w:val="en-US"/>
+        </w:rPr>
+        <w:t>.</w:t>
+      </w:r>
+    </w:p>
+    <w:p>
+      <w:pPr>
+        <w:spacing w:after="20" w:line="240" w:lineRule="auto"/>
+        <w:jc w:val="both"/>
+        <w:rPr>
+          <w:sz w:val="24"/>
+          <w:szCs w:val="24"/>
+          <w:shd w:val="clear" w:color="auto" w:fill="F9F9F9"/>
+          <w:lang w:val="en-US"/>
+        </w:rPr>
+      </w:pPr>
+      <w:proofErr w:type="spellStart"/>
+      <w:r>
+        <w:rPr>
+          <w:sz w:val="24"/>
+          <w:szCs w:val="24"/>
+          <w:shd w:val="clear" w:color="auto" w:fill="F9F9F9"/>
+          <w:lang w:val="en-US"/>
+        </w:rPr>
+        <w:t>PySpark</w:t>
+      </w:r>
+      <w:proofErr w:type="spellEnd"/>
+      <w:r>
+        <w:rPr>
+          <w:sz w:val="24"/>
+          <w:szCs w:val="24"/>
+          <w:shd w:val="clear" w:color="auto" w:fill="F9F9F9"/>
+          <w:lang w:val="en-US"/>
+        </w:rPr>
+        <w:t xml:space="preserve"> also supports nested structures using StructType within another StructType. This allows related fields, such as first name, middle name, and last name, to be grouped inside a single column of struct type.</w:t>
+      </w:r>
+    </w:p>
+    <w:p>
+      <w:pPr>
+        <w:spacing w:after="20" w:line="240" w:lineRule="auto"/>
+        <w:jc w:val="both"/>
+        <w:rPr>
+          <w:sz w:val="24"/>
+          <w:szCs w:val="24"/>
+          <w:shd w:val="clear" w:color="auto" w:fill="F9F9F9"/>
+          <w:lang w:val="en-US"/>
+        </w:rPr>
+      </w:pPr>
+      <w:r>
+        <w:rPr>
+          <w:sz w:val="24"/>
+          <w:szCs w:val="24"/>
+          <w:shd w:val="clear" w:color="auto" w:fill="F9F9F9"/>
+          <w:lang w:val="en-US"/>
+        </w:rPr>
+        <w:t xml:space="preserve">Finally, </w:t>
+      </w:r>
+      <w:proofErr w:type="spellStart"/>
+      <w:proofErr w:type="gramStart"/>
+      <w:r>
+        <w:rPr>
+          <w:sz w:val="24"/>
+          <w:szCs w:val="24"/>
+          <w:shd w:val="clear" w:color="auto" w:fill="F9F9F9"/>
+          <w:lang w:val="en-US"/>
+        </w:rPr>
+        <w:t>printSchema</w:t>
+      </w:r>
+      <w:proofErr w:type="spellEnd"/>
+      <w:r>
+        <w:rPr>
+          <w:sz w:val="24"/>
+          <w:szCs w:val="24"/>
+          <w:shd w:val="clear" w:color="auto" w:fill="F9F9F9"/>
+          <w:lang w:val="en-US"/>
+        </w:rPr>
+        <w:t>(</w:t>
+      </w:r>
+      <w:proofErr w:type="gramEnd"/>
+      <w:r>
+        <w:rPr>
+          <w:sz w:val="24"/>
+          <w:szCs w:val="24"/>
+          <w:shd w:val="clear" w:color="auto" w:fill="F9F9F9"/>
+          <w:lang w:val="en-US"/>
+        </w:rPr>
+        <w:t xml:space="preserve">) helps inspect the </w:t>
+      </w:r>
+      <w:proofErr w:type="spellStart"/>
+      <w:r>
+        <w:rPr>
+          <w:sz w:val="24"/>
+          <w:szCs w:val="24"/>
+          <w:shd w:val="clear" w:color="auto" w:fill="F9F9F9"/>
+          <w:lang w:val="en-US"/>
+        </w:rPr>
+        <w:t>DataFrame's</w:t>
+      </w:r>
+      <w:proofErr w:type="spellEnd"/>
+      <w:r>
+        <w:rPr>
+          <w:sz w:val="24"/>
+          <w:szCs w:val="24"/>
+          <w:shd w:val="clear" w:color="auto" w:fill="F9F9F9"/>
+          <w:lang w:val="en-US"/>
+        </w:rPr>
+        <w:t xml:space="preserve"> structure and data types, while </w:t>
+      </w:r>
+      <w:proofErr w:type="gramStart"/>
+      <w:r>
+        <w:rPr>
+          <w:sz w:val="24"/>
+          <w:szCs w:val="24"/>
+          <w:shd w:val="clear" w:color="auto" w:fill="F9F9F9"/>
+          <w:lang w:val="en-US"/>
+        </w:rPr>
+        <w:t>show(</w:t>
+      </w:r>
+      <w:proofErr w:type="gramEnd"/>
+      <w:r>
+        <w:rPr>
+          <w:sz w:val="24"/>
+          <w:szCs w:val="24"/>
+          <w:shd w:val="clear" w:color="auto" w:fill="F9F9F9"/>
+          <w:lang w:val="en-US"/>
+        </w:rPr>
+        <w:t xml:space="preserve">) displays its records. Understanding these concepts is essential for creating </w:t>
+      </w:r>
+      <w:proofErr w:type="spellStart"/>
+      <w:r>
+        <w:rPr>
+          <w:sz w:val="24"/>
+          <w:szCs w:val="24"/>
+          <w:shd w:val="clear" w:color="auto" w:fill="F9F9F9"/>
+          <w:lang w:val="en-US"/>
+        </w:rPr>
+        <w:t>DataFrames</w:t>
+      </w:r>
+      <w:proofErr w:type="spellEnd"/>
+      <w:r>
+        <w:rPr>
+          <w:sz w:val="24"/>
+          <w:szCs w:val="24"/>
+          <w:shd w:val="clear" w:color="auto" w:fill="F9F9F9"/>
+          <w:lang w:val="en-US"/>
+        </w:rPr>
+        <w:t xml:space="preserve"> with appropriate column names, data types, and structures, which helps maintain data consistency and supports efficient data processing in </w:t>
+      </w:r>
+      <w:proofErr w:type="spellStart"/>
+      <w:r>
+        <w:rPr>
+          <w:sz w:val="24"/>
+          <w:szCs w:val="24"/>
+          <w:shd w:val="clear" w:color="auto" w:fill="F9F9F9"/>
+          <w:lang w:val="en-US"/>
+        </w:rPr>
+        <w:t>PySpark</w:t>
+      </w:r>
+      <w:proofErr w:type="spellEnd"/>
+      <w:r>
+        <w:rPr>
+          <w:sz w:val="24"/>
+          <w:szCs w:val="24"/>
+          <w:shd w:val="clear" w:color="auto" w:fill="F9F9F9"/>
+          <w:lang w:val="en-US"/>
+        </w:rPr>
+        <w:t>.</w:t>
+      </w:r>
     </w:p>
     <w:p>
       <w:pPr>
@@ -5147,7 +8409,6 @@
   <w:style w:type="character" w:default="1" w:styleId="DefaultParagraphFont">
     <w:name w:val="Default Paragraph Font"/>
     <w:uiPriority w:val="1"/>
-    <w:semiHidden/>
     <w:unhideWhenUsed/>
   </w:style>
   <w:style w:type="table" w:default="1" w:styleId="TableNormal">

</xml_diff>